<commit_message>
docs: bridge PRD and prototype with two-way annotations, wireframe embeds and verification
</commit_message>
<xml_diff>
--- a/docs/PRD_英语学习网站MVP.docx
+++ b/docs/PRD_英语学习网站MVP.docx
@@ -984,6 +984,21 @@
           <w:sz w:val="21"/>
         </w:rPr>
         <w:t>13.2 参考资料</w:t>
+      </w:r>
+    </w:p>
+    <w:p>
+      <w:pPr>
+        <w:spacing w:after="20"/>
+        <w:ind w:left="340"/>
+      </w:pPr>
+      <w:r>
+        <w:rPr>
+          <w:rFonts w:ascii="Times New Roman" w:hAnsi="Times New Roman" w:eastAsia="宋体"/>
+          <w:b w:val="0"/>
+          <w:i w:val="0"/>
+          <w:sz w:val="21"/>
+        </w:rPr>
+        <w:t>13.3 原型走查说明（v0.2 新增）</w:t>
       </w:r>
     </w:p>
     <w:p>
@@ -1409,7 +1424,7 @@
                 <w:i w:val="0"/>
                 <w:sz w:val="20"/>
               </w:rPr>
-              <w:t>无（本仓库首份设计文档）</w:t>
+              <w:t>低保真原型：目录 `docs/Prototype/html/`（走查总览从 `index.html` 进入）；Figma 搭建规格：`docs/Prototype/figma/figma_spec.md`；PRD×原型双向对照表：`docs/Prototype/PRD_prototype_mapping.md`</w:t>
             </w:r>
           </w:p>
         </w:tc>
@@ -1643,6 +1658,88 @@
                 <w:sz w:val="20"/>
               </w:rPr>
               <w:t>MVP 首版定稿：定位、功能范围、核心流程、FR、用户故事、指标齐备</w:t>
+            </w:r>
+          </w:p>
+        </w:tc>
+      </w:tr>
+      <w:tr>
+        <w:tc>
+          <w:tcPr>
+            <w:tcW w:type="dxa" w:w="2268"/>
+          </w:tcPr>
+          <w:p>
+            <w:pPr>
+              <w:spacing w:after="40"/>
+            </w:pPr>
+            <w:r/>
+            <w:r>
+              <w:rPr>
+                <w:rFonts w:ascii="Times New Roman" w:hAnsi="Times New Roman" w:eastAsia="宋体"/>
+                <w:b w:val="0"/>
+                <w:i w:val="0"/>
+                <w:sz w:val="20"/>
+              </w:rPr>
+              <w:t>v0.2</w:t>
+            </w:r>
+          </w:p>
+        </w:tc>
+        <w:tc>
+          <w:tcPr>
+            <w:tcW w:type="dxa" w:w="2268"/>
+          </w:tcPr>
+          <w:p>
+            <w:pPr>
+              <w:spacing w:after="40"/>
+            </w:pPr>
+            <w:r/>
+            <w:r>
+              <w:rPr>
+                <w:rFonts w:ascii="Times New Roman" w:hAnsi="Times New Roman" w:eastAsia="宋体"/>
+                <w:b w:val="0"/>
+                <w:i w:val="0"/>
+                <w:sz w:val="20"/>
+              </w:rPr>
+              <w:t>2026-09-22</w:t>
+            </w:r>
+          </w:p>
+        </w:tc>
+        <w:tc>
+          <w:tcPr>
+            <w:tcW w:type="dxa" w:w="2268"/>
+          </w:tcPr>
+          <w:p>
+            <w:pPr>
+              <w:spacing w:after="40"/>
+            </w:pPr>
+            <w:r/>
+            <w:r>
+              <w:rPr>
+                <w:rFonts w:ascii="Times New Roman" w:hAnsi="Times New Roman" w:eastAsia="宋体"/>
+                <w:b w:val="0"/>
+                <w:i w:val="0"/>
+                <w:sz w:val="20"/>
+              </w:rPr>
+              <w:t>产品组</w:t>
+            </w:r>
+          </w:p>
+        </w:tc>
+        <w:tc>
+          <w:tcPr>
+            <w:tcW w:type="dxa" w:w="2268"/>
+          </w:tcPr>
+          <w:p>
+            <w:pPr>
+              <w:spacing w:after="40"/>
+            </w:pPr>
+            <w:r/>
+            <w:r>
+              <w:rPr>
+                <w:rFonts w:ascii="Times New Roman" w:hAnsi="Times New Roman" w:eastAsia="宋体"/>
+                <w:b w:val="0"/>
+                <w:i w:val="0"/>
+                <w:sz w:val="20"/>
+              </w:rPr>
+              <w:t>接入低保真原型：主线流程嵌入原型线框图、FR 补充原型页面引用、新增原型走查说明与页面索引</w:t>
             </w:r>
           </w:p>
         </w:tc>
@@ -6057,6 +6154,62 @@
     </w:p>
     <w:p>
       <w:pPr>
+        <w:spacing w:after="40"/>
+        <w:jc w:val="center"/>
+      </w:pPr>
+      <w:r>
+        <w:drawing>
+          <wp:inline xmlns:a="http://schemas.openxmlformats.org/drawingml/2006/main" xmlns:pic="http://schemas.openxmlformats.org/drawingml/2006/picture">
+            <wp:extent cx="5400000" cy="4500000"/>
+            <wp:docPr id="2" name="Picture 2"/>
+            <wp:cNvGraphicFramePr>
+              <a:graphicFrameLocks noChangeAspect="1"/>
+            </wp:cNvGraphicFramePr>
+            <a:graphic>
+              <a:graphicData uri="http://schemas.openxmlformats.org/drawingml/2006/picture">
+                <pic:pic>
+                  <pic:nvPicPr>
+                    <pic:cNvPr id="0" name="02_guest_trial.png"/>
+                    <pic:cNvPicPr/>
+                  </pic:nvPicPr>
+                  <pic:blipFill>
+                    <a:blip r:embed="rId12"/>
+                    <a:stretch>
+                      <a:fillRect/>
+                    </a:stretch>
+                  </pic:blipFill>
+                  <pic:spPr>
+                    <a:xfrm>
+                      <a:off x="0" y="0"/>
+                      <a:ext cx="5400000" cy="4500000"/>
+                    </a:xfrm>
+                    <a:prstGeom prst="rect"/>
+                  </pic:spPr>
+                </pic:pic>
+              </a:graphicData>
+            </a:graphic>
+          </wp:inline>
+        </w:drawing>
+      </w:r>
+    </w:p>
+    <w:p>
+      <w:pPr>
+        <w:spacing w:after="200"/>
+        <w:jc w:val="center"/>
+      </w:pPr>
+      <w:r>
+        <w:rPr>
+          <w:rFonts w:ascii="Times New Roman" w:hAnsi="Times New Roman" w:eastAsia="宋体"/>
+          <w:b w:val="0"/>
+          <w:i w:val="0"/>
+          <w:color w:val="1F4E79"/>
+          <w:sz w:val="18"/>
+        </w:rPr>
+        <w:t>原型线框：游客试学 5 词（对应漏斗「体验」阶段，注册门槛在正反馈之后）</w:t>
+      </w:r>
+    </w:p>
+    <w:p>
+      <w:pPr>
         <w:spacing w:after="160"/>
         <w:ind w:left="312"/>
       </w:pPr>
@@ -6094,7 +6247,7 @@
         <w:drawing>
           <wp:inline xmlns:a="http://schemas.openxmlformats.org/drawingml/2006/main" xmlns:pic="http://schemas.openxmlformats.org/drawingml/2006/picture">
             <wp:extent cx="5400000" cy="7105759"/>
-            <wp:docPr id="2" name="Picture 2"/>
+            <wp:docPr id="3" name="Picture 3"/>
             <wp:cNvGraphicFramePr>
               <a:graphicFrameLocks noChangeAspect="1"/>
             </wp:cNvGraphicFramePr>
@@ -6103,92 +6256,6 @@
                 <pic:pic>
                   <pic:nvPicPr>
                     <pic:cNvPr id="0" name="f2_daily.png"/>
-                    <pic:cNvPicPr/>
-                  </pic:nvPicPr>
-                  <pic:blipFill>
-                    <a:blip r:embed="rId12"/>
-                    <a:stretch>
-                      <a:fillRect/>
-                    </a:stretch>
-                  </pic:blipFill>
-                  <pic:spPr>
-                    <a:xfrm>
-                      <a:off x="0" y="0"/>
-                      <a:ext cx="5400000" cy="7105759"/>
-                    </a:xfrm>
-                    <a:prstGeom prst="rect"/>
-                  </pic:spPr>
-                </pic:pic>
-              </a:graphicData>
-            </a:graphic>
-          </wp:inline>
-        </w:drawing>
-      </w:r>
-    </w:p>
-    <w:p>
-      <w:pPr>
-        <w:spacing w:after="200"/>
-        <w:jc w:val="center"/>
-      </w:pPr>
-      <w:r>
-        <w:rPr>
-          <w:rFonts w:ascii="Times New Roman" w:hAnsi="Times New Roman" w:eastAsia="宋体"/>
-          <w:b w:val="0"/>
-          <w:i w:val="0"/>
-          <w:color w:val="666666"/>
-          <w:sz w:val="18"/>
-        </w:rPr>
-        <w:t>流程图 2：每日学习总流程</w:t>
-      </w:r>
-    </w:p>
-    <w:p>
-      <w:pPr>
-        <w:spacing w:after="160"/>
-        <w:ind w:left="312"/>
-      </w:pPr>
-      <w:r>
-        <w:rPr>
-          <w:rFonts w:ascii="Times New Roman" w:hAnsi="Times New Roman" w:eastAsia="宋体"/>
-          <w:b w:val="0"/>
-          <w:i/>
-          <w:color w:val="556370"/>
-          <w:sz w:val="20"/>
-        </w:rPr>
-        <w:t>设计要点：先复习（清积压，符合遗忘曲线），再学新词。复习为空则直接进入新词，保证用户「今天有可做之事」。</w:t>
-      </w:r>
-    </w:p>
-    <w:p>
-      <w:pPr>
-        <w:pStyle w:val="Heading2"/>
-      </w:pPr>
-      <w:r>
-        <w:rPr>
-          <w:rFonts w:ascii="Times New Roman" w:hAnsi="Times New Roman" w:eastAsia="宋体"/>
-          <w:b/>
-          <w:i w:val="0"/>
-          <w:sz w:val="28"/>
-        </w:rPr>
-        <w:t>4.3 新词学习与自评</w:t>
-      </w:r>
-    </w:p>
-    <w:p>
-      <w:pPr>
-        <w:spacing w:after="40"/>
-        <w:jc w:val="center"/>
-      </w:pPr>
-      <w:r>
-        <w:drawing>
-          <wp:inline xmlns:a="http://schemas.openxmlformats.org/drawingml/2006/main" xmlns:pic="http://schemas.openxmlformats.org/drawingml/2006/picture">
-            <wp:extent cx="5400000" cy="7105759"/>
-            <wp:docPr id="3" name="Picture 3"/>
-            <wp:cNvGraphicFramePr>
-              <a:graphicFrameLocks noChangeAspect="1"/>
-            </wp:cNvGraphicFramePr>
-            <a:graphic>
-              <a:graphicData uri="http://schemas.openxmlformats.org/drawingml/2006/picture">
-                <pic:pic>
-                  <pic:nvPicPr>
-                    <pic:cNvPr id="0" name="f3_new_word.png"/>
                     <pic:cNvPicPr/>
                   </pic:nvPicPr>
                   <pic:blipFill>
@@ -6224,48 +6291,18 @@
           <w:color w:val="666666"/>
           <w:sz w:val="18"/>
         </w:rPr>
-        <w:t>流程图 3：新词学习与自评</w:t>
+        <w:t>流程图 2：每日学习总流程</w:t>
       </w:r>
     </w:p>
     <w:p>
       <w:pPr>
-        <w:spacing w:after="160"/>
-        <w:ind w:left="312"/>
-      </w:pPr>
-      <w:r>
-        <w:rPr>
-          <w:rFonts w:ascii="Times New Roman" w:hAnsi="Times New Roman" w:eastAsia="宋体"/>
-          <w:b w:val="0"/>
-          <w:i/>
-          <w:color w:val="556370"/>
-          <w:sz w:val="20"/>
-        </w:rPr>
-        <w:t>设计要点：以「本轮内必须记住」为原则——不认识的词在本轮末尾反复出现，直至记成「认识」或「模糊」，保证每一次学习都有记忆发生。</w:t>
-      </w:r>
-    </w:p>
-    <w:p>
-      <w:pPr>
-        <w:pStyle w:val="Heading2"/>
-      </w:pPr>
-      <w:r>
-        <w:rPr>
-          <w:rFonts w:ascii="Times New Roman" w:hAnsi="Times New Roman" w:eastAsia="宋体"/>
-          <w:b/>
-          <w:i w:val="0"/>
-          <w:sz w:val="28"/>
-        </w:rPr>
-        <w:t>4.4 复习与间隔决策</w:t>
-      </w:r>
-    </w:p>
-    <w:p>
-      <w:pPr>
         <w:spacing w:after="40"/>
         <w:jc w:val="center"/>
       </w:pPr>
       <w:r>
         <w:drawing>
           <wp:inline xmlns:a="http://schemas.openxmlformats.org/drawingml/2006/main" xmlns:pic="http://schemas.openxmlformats.org/drawingml/2006/picture">
-            <wp:extent cx="5400000" cy="7105759"/>
+            <wp:extent cx="5400000" cy="4500000"/>
             <wp:docPr id="4" name="Picture 4"/>
             <wp:cNvGraphicFramePr>
               <a:graphicFrameLocks noChangeAspect="1"/>
@@ -6274,7 +6311,7 @@
               <a:graphicData uri="http://schemas.openxmlformats.org/drawingml/2006/picture">
                 <pic:pic>
                   <pic:nvPicPr>
-                    <pic:cNvPr id="0" name="f4_review.png"/>
+                    <pic:cNvPr id="0" name="06_today.png"/>
                     <pic:cNvPicPr/>
                   </pic:nvPicPr>
                   <pic:blipFill>
@@ -6286,7 +6323,7 @@
                   <pic:spPr>
                     <a:xfrm>
                       <a:off x="0" y="0"/>
-                      <a:ext cx="5400000" cy="7105759"/>
+                      <a:ext cx="5400000" cy="4500000"/>
                     </a:xfrm>
                     <a:prstGeom prst="rect"/>
                   </pic:spPr>
@@ -6307,10 +6344,10 @@
           <w:rFonts w:ascii="Times New Roman" w:hAnsi="Times New Roman" w:eastAsia="宋体"/>
           <w:b w:val="0"/>
           <w:i w:val="0"/>
-          <w:color w:val="666666"/>
+          <w:color w:val="1F4E79"/>
           <w:sz w:val="18"/>
         </w:rPr>
-        <w:t>流程图 4：复习四选一与间隔决策</w:t>
+        <w:t>原型线框：今日首页（任务面板：到期复习 X · 今日新词 Y，主按钮与连续天数）</w:t>
       </w:r>
     </w:p>
     <w:p>
@@ -6326,7 +6363,7 @@
           <w:color w:val="556370"/>
           <w:sz w:val="20"/>
         </w:rPr>
-        <w:t>设计要点：复习用客观评测（四选一）而非自评，数据更真实；答错的词记忆等级清零并回到今日队尾，直到答对为止。</w:t>
+        <w:t>设计要点：先复习（清积压，符合遗忘曲线），再学新词。复习为空则直接进入新词，保证用户「今天有可做之事」。</w:t>
       </w:r>
     </w:p>
     <w:p>
@@ -6340,7 +6377,7 @@
           <w:i w:val="0"/>
           <w:sz w:val="28"/>
         </w:rPr>
-        <w:t>4.5 缺席分批容错</w:t>
+        <w:t>4.3 新词学习与自评</w:t>
       </w:r>
     </w:p>
     <w:p>
@@ -6360,7 +6397,7 @@
               <a:graphicData uri="http://schemas.openxmlformats.org/drawingml/2006/picture">
                 <pic:pic>
                   <pic:nvPicPr>
-                    <pic:cNvPr id="0" name="f5_backlog.png"/>
+                    <pic:cNvPr id="0" name="f3_new_word.png"/>
                     <pic:cNvPicPr/>
                   </pic:nvPicPr>
                   <pic:blipFill>
@@ -6396,7 +6433,63 @@
           <w:color w:val="666666"/>
           <w:sz w:val="18"/>
         </w:rPr>
-        <w:t>流程图 5：缺席分批容错</w:t>
+        <w:t>流程图 3：新词学习与自评</w:t>
+      </w:r>
+    </w:p>
+    <w:p>
+      <w:pPr>
+        <w:spacing w:after="40"/>
+        <w:jc w:val="center"/>
+      </w:pPr>
+      <w:r>
+        <w:drawing>
+          <wp:inline xmlns:a="http://schemas.openxmlformats.org/drawingml/2006/main" xmlns:pic="http://schemas.openxmlformats.org/drawingml/2006/picture">
+            <wp:extent cx="5400000" cy="4500000"/>
+            <wp:docPr id="6" name="Picture 6"/>
+            <wp:cNvGraphicFramePr>
+              <a:graphicFrameLocks noChangeAspect="1"/>
+            </wp:cNvGraphicFramePr>
+            <a:graphic>
+              <a:graphicData uri="http://schemas.openxmlformats.org/drawingml/2006/picture">
+                <pic:pic>
+                  <pic:nvPicPr>
+                    <pic:cNvPr id="0" name="07_new_word.png"/>
+                    <pic:cNvPicPr/>
+                  </pic:nvPicPr>
+                  <pic:blipFill>
+                    <a:blip r:embed="rId16"/>
+                    <a:stretch>
+                      <a:fillRect/>
+                    </a:stretch>
+                  </pic:blipFill>
+                  <pic:spPr>
+                    <a:xfrm>
+                      <a:off x="0" y="0"/>
+                      <a:ext cx="5400000" cy="4500000"/>
+                    </a:xfrm>
+                    <a:prstGeom prst="rect"/>
+                  </pic:spPr>
+                </pic:pic>
+              </a:graphicData>
+            </a:graphic>
+          </wp:inline>
+        </w:drawing>
+      </w:r>
+    </w:p>
+    <w:p>
+      <w:pPr>
+        <w:spacing w:after="200"/>
+        <w:jc w:val="center"/>
+      </w:pPr>
+      <w:r>
+        <w:rPr>
+          <w:rFonts w:ascii="Times New Roman" w:hAnsi="Times New Roman" w:eastAsia="宋体"/>
+          <w:b w:val="0"/>
+          <w:i w:val="0"/>
+          <w:color w:val="1F4E79"/>
+          <w:sz w:val="18"/>
+        </w:rPr>
+        <w:t>原型线框：新词学习页（卡片全量信息 + 三态自评 + 本轮待巩固列表）</w:t>
       </w:r>
     </w:p>
     <w:p>
@@ -6412,7 +6505,7 @@
           <w:color w:val="556370"/>
           <w:sz w:val="20"/>
         </w:rPr>
-        <w:t>设计要点：缺席回归是用户流失率最高的时刻。积压超过每日上限时分批摊开，用「追得回来」的心理替代「放弃」。</w:t>
+        <w:t>设计要点：以「本轮内必须记住」为原则——不认识的词在本轮末尾反复出现，直至记成「认识」或「模糊」，保证每一次学习都有记忆发生。</w:t>
       </w:r>
     </w:p>
     <w:p>
@@ -6426,7 +6519,7 @@
           <w:i w:val="0"/>
           <w:sz w:val="28"/>
         </w:rPr>
-        <w:t>4.6 词书切换</w:t>
+        <w:t>4.4 复习与间隔决策</w:t>
       </w:r>
     </w:p>
     <w:p>
@@ -6438,7 +6531,7 @@
         <w:drawing>
           <wp:inline xmlns:a="http://schemas.openxmlformats.org/drawingml/2006/main" xmlns:pic="http://schemas.openxmlformats.org/drawingml/2006/picture">
             <wp:extent cx="5400000" cy="7105759"/>
-            <wp:docPr id="6" name="Picture 6"/>
+            <wp:docPr id="7" name="Picture 7"/>
             <wp:cNvGraphicFramePr>
               <a:graphicFrameLocks noChangeAspect="1"/>
             </wp:cNvGraphicFramePr>
@@ -6446,11 +6539,11 @@
               <a:graphicData uri="http://schemas.openxmlformats.org/drawingml/2006/picture">
                 <pic:pic>
                   <pic:nvPicPr>
-                    <pic:cNvPr id="0" name="f6_switch.png"/>
+                    <pic:cNvPr id="0" name="f4_review.png"/>
                     <pic:cNvPicPr/>
                   </pic:nvPicPr>
                   <pic:blipFill>
-                    <a:blip r:embed="rId16"/>
+                    <a:blip r:embed="rId17"/>
                     <a:stretch>
                       <a:fillRect/>
                     </a:stretch>
@@ -6482,7 +6575,347 @@
           <w:color w:val="666666"/>
           <w:sz w:val="18"/>
         </w:rPr>
+        <w:t>流程图 4：复习四选一与间隔决策</w:t>
+      </w:r>
+    </w:p>
+    <w:p>
+      <w:pPr>
+        <w:spacing w:after="40"/>
+        <w:jc w:val="center"/>
+      </w:pPr>
+      <w:r>
+        <w:drawing>
+          <wp:inline xmlns:a="http://schemas.openxmlformats.org/drawingml/2006/main" xmlns:pic="http://schemas.openxmlformats.org/drawingml/2006/picture">
+            <wp:extent cx="5400000" cy="4500000"/>
+            <wp:docPr id="8" name="Picture 8"/>
+            <wp:cNvGraphicFramePr>
+              <a:graphicFrameLocks noChangeAspect="1"/>
+            </wp:cNvGraphicFramePr>
+            <a:graphic>
+              <a:graphicData uri="http://schemas.openxmlformats.org/drawingml/2006/picture">
+                <pic:pic>
+                  <pic:nvPicPr>
+                    <pic:cNvPr id="0" name="08_review.png"/>
+                    <pic:cNvPicPr/>
+                  </pic:nvPicPr>
+                  <pic:blipFill>
+                    <a:blip r:embed="rId18"/>
+                    <a:stretch>
+                      <a:fillRect/>
+                    </a:stretch>
+                  </pic:blipFill>
+                  <pic:spPr>
+                    <a:xfrm>
+                      <a:off x="0" y="0"/>
+                      <a:ext cx="5400000" cy="4500000"/>
+                    </a:xfrm>
+                    <a:prstGeom prst="rect"/>
+                  </pic:spPr>
+                </pic:pic>
+              </a:graphicData>
+            </a:graphic>
+          </wp:inline>
+        </w:drawing>
+      </w:r>
+    </w:p>
+    <w:p>
+      <w:pPr>
+        <w:spacing w:after="200"/>
+        <w:jc w:val="center"/>
+      </w:pPr>
+      <w:r>
+        <w:rPr>
+          <w:rFonts w:ascii="Times New Roman" w:hAnsi="Times New Roman" w:eastAsia="宋体"/>
+          <w:b w:val="0"/>
+          <w:i w:val="0"/>
+          <w:color w:val="1F4E79"/>
+          <w:sz w:val="18"/>
+        </w:rPr>
+        <w:t>原型线框：复习页（隐藏释义防偷看，四选一作答，答对展示间隔升级）</w:t>
+      </w:r>
+    </w:p>
+    <w:p>
+      <w:pPr>
+        <w:spacing w:after="160"/>
+        <w:ind w:left="312"/>
+      </w:pPr>
+      <w:r>
+        <w:rPr>
+          <w:rFonts w:ascii="Times New Roman" w:hAnsi="Times New Roman" w:eastAsia="宋体"/>
+          <w:b w:val="0"/>
+          <w:i/>
+          <w:color w:val="556370"/>
+          <w:sz w:val="20"/>
+        </w:rPr>
+        <w:t>设计要点：复习用客观评测（四选一）而非自评，数据更真实；答错的词记忆等级清零并回到今日队尾，直到答对为止。</w:t>
+      </w:r>
+    </w:p>
+    <w:p>
+      <w:pPr>
+        <w:pStyle w:val="Heading2"/>
+      </w:pPr>
+      <w:r>
+        <w:rPr>
+          <w:rFonts w:ascii="Times New Roman" w:hAnsi="Times New Roman" w:eastAsia="宋体"/>
+          <w:b/>
+          <w:i w:val="0"/>
+          <w:sz w:val="28"/>
+        </w:rPr>
+        <w:t>4.5 缺席分批容错</w:t>
+      </w:r>
+    </w:p>
+    <w:p>
+      <w:pPr>
+        <w:spacing w:after="40"/>
+        <w:jc w:val="center"/>
+      </w:pPr>
+      <w:r>
+        <w:drawing>
+          <wp:inline xmlns:a="http://schemas.openxmlformats.org/drawingml/2006/main" xmlns:pic="http://schemas.openxmlformats.org/drawingml/2006/picture">
+            <wp:extent cx="5400000" cy="7105759"/>
+            <wp:docPr id="9" name="Picture 9"/>
+            <wp:cNvGraphicFramePr>
+              <a:graphicFrameLocks noChangeAspect="1"/>
+            </wp:cNvGraphicFramePr>
+            <a:graphic>
+              <a:graphicData uri="http://schemas.openxmlformats.org/drawingml/2006/picture">
+                <pic:pic>
+                  <pic:nvPicPr>
+                    <pic:cNvPr id="0" name="f5_backlog.png"/>
+                    <pic:cNvPicPr/>
+                  </pic:nvPicPr>
+                  <pic:blipFill>
+                    <a:blip r:embed="rId19"/>
+                    <a:stretch>
+                      <a:fillRect/>
+                    </a:stretch>
+                  </pic:blipFill>
+                  <pic:spPr>
+                    <a:xfrm>
+                      <a:off x="0" y="0"/>
+                      <a:ext cx="5400000" cy="7105759"/>
+                    </a:xfrm>
+                    <a:prstGeom prst="rect"/>
+                  </pic:spPr>
+                </pic:pic>
+              </a:graphicData>
+            </a:graphic>
+          </wp:inline>
+        </w:drawing>
+      </w:r>
+    </w:p>
+    <w:p>
+      <w:pPr>
+        <w:spacing w:after="200"/>
+        <w:jc w:val="center"/>
+      </w:pPr>
+      <w:r>
+        <w:rPr>
+          <w:rFonts w:ascii="Times New Roman" w:hAnsi="Times New Roman" w:eastAsia="宋体"/>
+          <w:b w:val="0"/>
+          <w:i w:val="0"/>
+          <w:color w:val="666666"/>
+          <w:sz w:val="18"/>
+        </w:rPr>
+        <w:t>流程图 5：缺席分批容错</w:t>
+      </w:r>
+    </w:p>
+    <w:p>
+      <w:pPr>
+        <w:spacing w:after="40"/>
+        <w:jc w:val="center"/>
+      </w:pPr>
+      <w:r>
+        <w:drawing>
+          <wp:inline xmlns:a="http://schemas.openxmlformats.org/drawingml/2006/main" xmlns:pic="http://schemas.openxmlformats.org/drawingml/2006/picture">
+            <wp:extent cx="5400000" cy="4500000"/>
+            <wp:docPr id="10" name="Picture 10"/>
+            <wp:cNvGraphicFramePr>
+              <a:graphicFrameLocks noChangeAspect="1"/>
+            </wp:cNvGraphicFramePr>
+            <a:graphic>
+              <a:graphicData uri="http://schemas.openxmlformats.org/drawingml/2006/picture">
+                <pic:pic>
+                  <pic:nvPicPr>
+                    <pic:cNvPr id="0" name="10_backlog.png"/>
+                    <pic:cNvPicPr/>
+                  </pic:nvPicPr>
+                  <pic:blipFill>
+                    <a:blip r:embed="rId20"/>
+                    <a:stretch>
+                      <a:fillRect/>
+                    </a:stretch>
+                  </pic:blipFill>
+                  <pic:spPr>
+                    <a:xfrm>
+                      <a:off x="0" y="0"/>
+                      <a:ext cx="5400000" cy="4500000"/>
+                    </a:xfrm>
+                    <a:prstGeom prst="rect"/>
+                  </pic:spPr>
+                </pic:pic>
+              </a:graphicData>
+            </a:graphic>
+          </wp:inline>
+        </w:drawing>
+      </w:r>
+    </w:p>
+    <w:p>
+      <w:pPr>
+        <w:spacing w:after="200"/>
+        <w:jc w:val="center"/>
+      </w:pPr>
+      <w:r>
+        <w:rPr>
+          <w:rFonts w:ascii="Times New Roman" w:hAnsi="Times New Roman" w:eastAsia="宋体"/>
+          <w:b w:val="0"/>
+          <w:i w:val="0"/>
+          <w:color w:val="1F4E79"/>
+          <w:sz w:val="18"/>
+        </w:rPr>
+        <w:t>原型线框：缺席回归面板（积压分批 + 无惩罚安正文案）</w:t>
+      </w:r>
+    </w:p>
+    <w:p>
+      <w:pPr>
+        <w:spacing w:after="160"/>
+        <w:ind w:left="312"/>
+      </w:pPr>
+      <w:r>
+        <w:rPr>
+          <w:rFonts w:ascii="Times New Roman" w:hAnsi="Times New Roman" w:eastAsia="宋体"/>
+          <w:b w:val="0"/>
+          <w:i/>
+          <w:color w:val="556370"/>
+          <w:sz w:val="20"/>
+        </w:rPr>
+        <w:t>设计要点：缺席回归是用户流失率最高的时刻。积压超过每日上限时分批摊开，用「追得回来」的心理替代「放弃」。</w:t>
+      </w:r>
+    </w:p>
+    <w:p>
+      <w:pPr>
+        <w:pStyle w:val="Heading2"/>
+      </w:pPr>
+      <w:r>
+        <w:rPr>
+          <w:rFonts w:ascii="Times New Roman" w:hAnsi="Times New Roman" w:eastAsia="宋体"/>
+          <w:b/>
+          <w:i w:val="0"/>
+          <w:sz w:val="28"/>
+        </w:rPr>
+        <w:t>4.6 词书切换</w:t>
+      </w:r>
+    </w:p>
+    <w:p>
+      <w:pPr>
+        <w:spacing w:after="40"/>
+        <w:jc w:val="center"/>
+      </w:pPr>
+      <w:r>
+        <w:drawing>
+          <wp:inline xmlns:a="http://schemas.openxmlformats.org/drawingml/2006/main" xmlns:pic="http://schemas.openxmlformats.org/drawingml/2006/picture">
+            <wp:extent cx="5400000" cy="7105759"/>
+            <wp:docPr id="11" name="Picture 11"/>
+            <wp:cNvGraphicFramePr>
+              <a:graphicFrameLocks noChangeAspect="1"/>
+            </wp:cNvGraphicFramePr>
+            <a:graphic>
+              <a:graphicData uri="http://schemas.openxmlformats.org/drawingml/2006/picture">
+                <pic:pic>
+                  <pic:nvPicPr>
+                    <pic:cNvPr id="0" name="f6_switch.png"/>
+                    <pic:cNvPicPr/>
+                  </pic:nvPicPr>
+                  <pic:blipFill>
+                    <a:blip r:embed="rId21"/>
+                    <a:stretch>
+                      <a:fillRect/>
+                    </a:stretch>
+                  </pic:blipFill>
+                  <pic:spPr>
+                    <a:xfrm>
+                      <a:off x="0" y="0"/>
+                      <a:ext cx="5400000" cy="7105759"/>
+                    </a:xfrm>
+                    <a:prstGeom prst="rect"/>
+                  </pic:spPr>
+                </pic:pic>
+              </a:graphicData>
+            </a:graphic>
+          </wp:inline>
+        </w:drawing>
+      </w:r>
+    </w:p>
+    <w:p>
+      <w:pPr>
+        <w:spacing w:after="200"/>
+        <w:jc w:val="center"/>
+      </w:pPr>
+      <w:r>
+        <w:rPr>
+          <w:rFonts w:ascii="Times New Roman" w:hAnsi="Times New Roman" w:eastAsia="宋体"/>
+          <w:b w:val="0"/>
+          <w:i w:val="0"/>
+          <w:color w:val="666666"/>
+          <w:sz w:val="18"/>
+        </w:rPr>
         <w:t>流程图 6：词书切换</w:t>
+      </w:r>
+    </w:p>
+    <w:p>
+      <w:pPr>
+        <w:spacing w:after="40"/>
+        <w:jc w:val="center"/>
+      </w:pPr>
+      <w:r>
+        <w:drawing>
+          <wp:inline xmlns:a="http://schemas.openxmlformats.org/drawingml/2006/main" xmlns:pic="http://schemas.openxmlformats.org/drawingml/2006/picture">
+            <wp:extent cx="5400000" cy="4500000"/>
+            <wp:docPr id="12" name="Picture 12"/>
+            <wp:cNvGraphicFramePr>
+              <a:graphicFrameLocks noChangeAspect="1"/>
+            </wp:cNvGraphicFramePr>
+            <a:graphic>
+              <a:graphicData uri="http://schemas.openxmlformats.org/drawingml/2006/picture">
+                <pic:pic>
+                  <pic:nvPicPr>
+                    <pic:cNvPr id="0" name="13_books.png"/>
+                    <pic:cNvPicPr/>
+                  </pic:nvPicPr>
+                  <pic:blipFill>
+                    <a:blip r:embed="rId22"/>
+                    <a:stretch>
+                      <a:fillRect/>
+                    </a:stretch>
+                  </pic:blipFill>
+                  <pic:spPr>
+                    <a:xfrm>
+                      <a:off x="0" y="0"/>
+                      <a:ext cx="5400000" cy="4500000"/>
+                    </a:xfrm>
+                    <a:prstGeom prst="rect"/>
+                  </pic:spPr>
+                </pic:pic>
+              </a:graphicData>
+            </a:graphic>
+          </wp:inline>
+        </w:drawing>
+      </w:r>
+    </w:p>
+    <w:p>
+      <w:pPr>
+        <w:spacing w:after="200"/>
+        <w:jc w:val="center"/>
+      </w:pPr>
+      <w:r>
+        <w:rPr>
+          <w:rFonts w:ascii="Times New Roman" w:hAnsi="Times New Roman" w:eastAsia="宋体"/>
+          <w:b w:val="0"/>
+          <w:i w:val="0"/>
+          <w:color w:val="1F4E79"/>
+          <w:sz w:val="18"/>
+        </w:rPr>
+        <w:t>原型线框：词书列表与切换（多词书并行、进度独立）</w:t>
       </w:r>
     </w:p>
     <w:p>
@@ -6795,6 +7228,22 @@
     </w:p>
     <w:p>
       <w:pPr>
+        <w:spacing w:after="160"/>
+        <w:ind w:left="312"/>
+      </w:pPr>
+      <w:r>
+        <w:rPr>
+          <w:rFonts w:ascii="Times New Roman" w:hAnsi="Times New Roman" w:eastAsia="宋体"/>
+          <w:b w:val="0"/>
+          <w:i/>
+          <w:color w:val="556370"/>
+          <w:sz w:val="20"/>
+        </w:rPr>
+        <w:t>原型页面：`00_landing.html`（落地）· `01_book_detail.html`（词书详情）· `02_guest_trial.html`（游客试学）· `03_signup.html`（注册）· `04_login.html`（登录）</w:t>
+      </w:r>
+    </w:p>
+    <w:p>
+      <w:pPr>
         <w:pStyle w:val="Heading2"/>
       </w:pPr>
       <w:r>
@@ -7012,6 +7461,22 @@
     </w:p>
     <w:p>
       <w:pPr>
+        <w:spacing w:after="160"/>
+        <w:ind w:left="312"/>
+      </w:pPr>
+      <w:r>
+        <w:rPr>
+          <w:rFonts w:ascii="Times New Roman" w:hAnsi="Times New Roman" w:eastAsia="宋体"/>
+          <w:b w:val="0"/>
+          <w:i/>
+          <w:color w:val="556370"/>
+          <w:sz w:val="20"/>
+        </w:rPr>
+        <w:t>原型页面：`05_onboarding.html`（首次设置向导）· `12_settings.html`（学习设置）</w:t>
+      </w:r>
+    </w:p>
+    <w:p>
+      <w:pPr>
         <w:pStyle w:val="Heading2"/>
       </w:pPr>
       <w:r>
@@ -7229,6 +7694,22 @@
     </w:p>
     <w:p>
       <w:pPr>
+        <w:spacing w:after="160"/>
+        <w:ind w:left="312"/>
+      </w:pPr>
+      <w:r>
+        <w:rPr>
+          <w:rFonts w:ascii="Times New Roman" w:hAnsi="Times New Roman" w:eastAsia="宋体"/>
+          <w:b w:val="0"/>
+          <w:i/>
+          <w:color w:val="556370"/>
+          <w:sz w:val="20"/>
+        </w:rPr>
+        <w:t>原型页面：`06_today.html`（今日首页，含无任务空态变体）</w:t>
+      </w:r>
+    </w:p>
+    <w:p>
+      <w:pPr>
         <w:pStyle w:val="Heading2"/>
       </w:pPr>
       <w:r>
@@ -7477,6 +7958,22 @@
     </w:p>
     <w:p>
       <w:pPr>
+        <w:spacing w:after="160"/>
+        <w:ind w:left="312"/>
+      </w:pPr>
+      <w:r>
+        <w:rPr>
+          <w:rFonts w:ascii="Times New Roman" w:hAnsi="Times New Roman" w:eastAsia="宋体"/>
+          <w:b w:val="0"/>
+          <w:i/>
+          <w:color w:val="556370"/>
+          <w:sz w:val="20"/>
+        </w:rPr>
+        <w:t>原型页面：`02_guest_trial.html`（试学 5 词）· `07_new_word.html`（新词卡片 + 三态自评 + 本轮待巩固）</w:t>
+      </w:r>
+    </w:p>
+    <w:p>
+      <w:pPr>
         <w:pStyle w:val="Heading2"/>
       </w:pPr>
       <w:r>
@@ -7721,6 +8218,22 @@
           <w:sz w:val="21"/>
         </w:rPr>
         <w:t>答错词当日必再出现一次。</w:t>
+      </w:r>
+    </w:p>
+    <w:p>
+      <w:pPr>
+        <w:spacing w:after="160"/>
+        <w:ind w:left="312"/>
+      </w:pPr>
+      <w:r>
+        <w:rPr>
+          <w:rFonts w:ascii="Times New Roman" w:hAnsi="Times New Roman" w:eastAsia="宋体"/>
+          <w:b w:val="0"/>
+          <w:i/>
+          <w:color w:val="556370"/>
+          <w:sz w:val="20"/>
+        </w:rPr>
+        <w:t>原型页面：`08_review.html`（四选一自测，作答前不显示释义）</w:t>
       </w:r>
     </w:p>
     <w:p>
@@ -8315,6 +8828,22 @@
     </w:p>
     <w:p>
       <w:pPr>
+        <w:spacing w:after="160"/>
+        <w:ind w:left="312"/>
+      </w:pPr>
+      <w:r>
+        <w:rPr>
+          <w:rFonts w:ascii="Times New Roman" w:hAnsi="Times New Roman" w:eastAsia="宋体"/>
+          <w:b w:val="0"/>
+          <w:i/>
+          <w:color w:val="556370"/>
+          <w:sz w:val="20"/>
+        </w:rPr>
+        <w:t>原型页面：`08_review.html`（作答反馈展示）· `11_stats.html`（间隔表）· `12_settings.html`（规则透明展示）</w:t>
+      </w:r>
+    </w:p>
+    <w:p>
+      <w:pPr>
         <w:pStyle w:val="Heading2"/>
       </w:pPr>
       <w:r>
@@ -8563,6 +9092,22 @@
     </w:p>
     <w:p>
       <w:pPr>
+        <w:spacing w:after="160"/>
+        <w:ind w:left="312"/>
+      </w:pPr>
+      <w:r>
+        <w:rPr>
+          <w:rFonts w:ascii="Times New Roman" w:hAnsi="Times New Roman" w:eastAsia="宋体"/>
+          <w:b w:val="0"/>
+          <w:i/>
+          <w:color w:val="556370"/>
+          <w:sz w:val="20"/>
+        </w:rPr>
+        <w:t>原型页面：`10_backlog.html`（缺席回归分批容错面板）</w:t>
+      </w:r>
+    </w:p>
+    <w:p>
+      <w:pPr>
         <w:pStyle w:val="Heading2"/>
       </w:pPr>
       <w:r>
@@ -8767,6 +9312,22 @@
     </w:p>
     <w:p>
       <w:pPr>
+        <w:spacing w:after="160"/>
+        <w:ind w:left="312"/>
+      </w:pPr>
+      <w:r>
+        <w:rPr>
+          <w:rFonts w:ascii="Times New Roman" w:hAnsi="Times New Roman" w:eastAsia="宋体"/>
+          <w:b w:val="0"/>
+          <w:i/>
+          <w:color w:val="556370"/>
+          <w:sz w:val="20"/>
+        </w:rPr>
+        <w:t>原型页面：`06_today.html`（顶部 streak）· `09_done.html`（打卡成功 + streak+1）· `11_stats.html`（核心数字）</w:t>
+      </w:r>
+    </w:p>
+    <w:p>
+      <w:pPr>
         <w:pStyle w:val="Heading2"/>
       </w:pPr>
       <w:r>
@@ -8925,6 +9486,22 @@
     </w:p>
     <w:p>
       <w:pPr>
+        <w:spacing w:after="160"/>
+        <w:ind w:left="312"/>
+      </w:pPr>
+      <w:r>
+        <w:rPr>
+          <w:rFonts w:ascii="Times New Roman" w:hAnsi="Times New Roman" w:eastAsia="宋体"/>
+          <w:b w:val="0"/>
+          <w:i/>
+          <w:color w:val="556370"/>
+          <w:sz w:val="20"/>
+        </w:rPr>
+        <w:t>原型页面：`11_stats.html`（核心数字 / 词书进度 / 近 7 日热力图）</w:t>
+      </w:r>
+    </w:p>
+    <w:p>
+      <w:pPr>
         <w:pStyle w:val="Heading2"/>
       </w:pPr>
       <w:r>
@@ -9157,6 +9734,22 @@
     </w:p>
     <w:p>
       <w:pPr>
+        <w:spacing w:after="160"/>
+        <w:ind w:left="312"/>
+      </w:pPr>
+      <w:r>
+        <w:rPr>
+          <w:rFonts w:ascii="Times New Roman" w:hAnsi="Times New Roman" w:eastAsia="宋体"/>
+          <w:b w:val="0"/>
+          <w:i/>
+          <w:color w:val="556370"/>
+          <w:sz w:val="20"/>
+        </w:rPr>
+        <w:t>原型页面：`01_book_detail.html`（公开详情）· `13_books.html`（词书列表）· `14_feedback.html`（纠错弹层）</w:t>
+      </w:r>
+    </w:p>
+    <w:p>
+      <w:pPr>
         <w:pStyle w:val="Heading2"/>
       </w:pPr>
       <w:r>
@@ -9326,6 +9919,22 @@
           <w:sz w:val="21"/>
         </w:rPr>
         <w:t>切换后回到旧词书，进度分毫不丢。</w:t>
+      </w:r>
+    </w:p>
+    <w:p>
+      <w:pPr>
+        <w:spacing w:after="160"/>
+        <w:ind w:left="312"/>
+      </w:pPr>
+      <w:r>
+        <w:rPr>
+          <w:rFonts w:ascii="Times New Roman" w:hAnsi="Times New Roman" w:eastAsia="宋体"/>
+          <w:b w:val="0"/>
+          <w:i/>
+          <w:color w:val="556370"/>
+          <w:sz w:val="20"/>
+        </w:rPr>
+        <w:t>原型页面：`13_books.html`（词书列表与切换）· `12_settings.html`（词书管理）</w:t>
       </w:r>
     </w:p>
     <w:p>
@@ -13498,6 +14107,2249 @@
           <w:sz w:val="21"/>
         </w:rPr>
         <w:t>开发规范见仓库根目录 AGENTS.md（每次改动需提交 Git 并附测试验证）</w:t>
+      </w:r>
+    </w:p>
+    <w:p>
+      <w:pPr>
+        <w:pStyle w:val="Heading2"/>
+      </w:pPr>
+      <w:r>
+        <w:rPr>
+          <w:rFonts w:ascii="Times New Roman" w:hAnsi="Times New Roman" w:eastAsia="宋体"/>
+          <w:b/>
+          <w:i w:val="0"/>
+          <w:sz w:val="28"/>
+        </w:rPr>
+        <w:t>13.3 原型走查说明（v0.2 新增）</w:t>
+      </w:r>
+    </w:p>
+    <w:p>
+      <w:pPr>
+        <w:spacing w:after="120"/>
+      </w:pPr>
+      <w:r>
+        <w:rPr>
+          <w:rFonts w:ascii="Times New Roman" w:hAnsi="Times New Roman" w:eastAsia="宋体"/>
+          <w:b/>
+          <w:i w:val="0"/>
+          <w:sz w:val="21"/>
+        </w:rPr>
+        <w:t>入口与用法</w:t>
+      </w:r>
+      <w:r>
+        <w:rPr>
+          <w:rFonts w:ascii="Times New Roman" w:hAnsi="Times New Roman" w:eastAsia="宋体"/>
+          <w:b w:val="0"/>
+          <w:i w:val="0"/>
+          <w:sz w:val="21"/>
+        </w:rPr>
+        <w:t>：打开 `docs/Prototype/html/index.html`，从「6 条核心流程走查」开始逐页点击走查（桌面 1440px 优先，各页顶部有 360 / 768 / 1440 断点标注）。</w:t>
+      </w:r>
+    </w:p>
+    <w:p>
+      <w:pPr>
+        <w:spacing w:after="120"/>
+      </w:pPr>
+      <w:r>
+        <w:rPr>
+          <w:rFonts w:ascii="Times New Roman" w:hAnsi="Times New Roman" w:eastAsia="宋体"/>
+          <w:b/>
+          <w:i w:val="0"/>
+          <w:sz w:val="21"/>
+        </w:rPr>
+        <w:t>低保真约定</w:t>
+      </w:r>
+      <w:r>
+        <w:rPr>
+          <w:rFonts w:ascii="Times New Roman" w:hAnsi="Times New Roman" w:eastAsia="宋体"/>
+          <w:b w:val="0"/>
+          <w:i w:val="0"/>
+          <w:sz w:val="21"/>
+        </w:rPr>
+        <w:t>：</w:t>
+      </w:r>
+    </w:p>
+    <w:p>
+      <w:pPr>
+        <w:pStyle w:val="ListBullet"/>
+        <w:spacing w:after="60"/>
+      </w:pPr>
+      <w:r>
+        <w:rPr>
+          <w:rFonts w:ascii="Times New Roman" w:hAnsi="Times New Roman" w:eastAsia="宋体"/>
+          <w:b w:val="0"/>
+          <w:i w:val="0"/>
+          <w:sz w:val="21"/>
+        </w:rPr>
+        <w:t>灰阶线框 + 单一强调色，黄色虚线块为线框注释（状态标注 / 验收标准 / 交互说明，交付后移除）；</w:t>
+      </w:r>
+    </w:p>
+    <w:p>
+      <w:pPr>
+        <w:pStyle w:val="ListBullet"/>
+        <w:spacing w:after="60"/>
+      </w:pPr>
+      <w:r>
+        <w:rPr>
+          <w:rFonts w:ascii="Times New Roman" w:hAnsi="Times New Roman" w:eastAsia="宋体"/>
+          <w:b w:val="0"/>
+          <w:i w:val="0"/>
+          <w:sz w:val="21"/>
+        </w:rPr>
+        <w:t>单词与进度均为示意数据，正式数据以后端为准；</w:t>
+      </w:r>
+    </w:p>
+    <w:p>
+      <w:pPr>
+        <w:pStyle w:val="ListBullet"/>
+        <w:spacing w:after="60"/>
+      </w:pPr>
+      <w:r>
+        <w:rPr>
+          <w:rFonts w:ascii="Times New Roman" w:hAnsi="Times New Roman" w:eastAsia="宋体"/>
+          <w:b w:val="0"/>
+          <w:i w:val="0"/>
+          <w:sz w:val="21"/>
+        </w:rPr>
+        <w:t>每页顶部「PRD 对照标注条」标明其对应的 §4 流程、FR、用户故事、里程碑，以 `docs/Prototype/PRD_prototype_mapping.md` 为基准，由 `docs/tools/verify_prototype.py` 强制校验；</w:t>
+      </w:r>
+    </w:p>
+    <w:p>
+      <w:pPr>
+        <w:pStyle w:val="ListBullet"/>
+        <w:spacing w:after="60"/>
+      </w:pPr>
+      <w:r>
+        <w:rPr>
+          <w:rFonts w:ascii="Times New Roman" w:hAnsi="Times New Roman" w:eastAsia="宋体"/>
+          <w:b w:val="0"/>
+          <w:i w:val="0"/>
+          <w:sz w:val="21"/>
+        </w:rPr>
+        <w:t>Figma 搭建规格见 `docs/Prototype/figma/figma_spec.md`（页面树、组件、栅格、token 与 HTML 一一对应）。</w:t>
+      </w:r>
+    </w:p>
+    <w:p>
+      <w:pPr>
+        <w:spacing w:after="120"/>
+      </w:pPr>
+      <w:r>
+        <w:rPr>
+          <w:rFonts w:ascii="Times New Roman" w:hAnsi="Times New Roman" w:eastAsia="宋体"/>
+          <w:b/>
+          <w:i w:val="0"/>
+          <w:sz w:val="21"/>
+        </w:rPr>
+        <w:t>页面索引（15 页）</w:t>
+      </w:r>
+      <w:r>
+        <w:rPr>
+          <w:rFonts w:ascii="Times New Roman" w:hAnsi="Times New Roman" w:eastAsia="宋体"/>
+          <w:b w:val="0"/>
+          <w:i w:val="0"/>
+          <w:sz w:val="21"/>
+        </w:rPr>
+        <w:t>：</w:t>
+      </w:r>
+    </w:p>
+    <w:tbl>
+      <w:tblPr>
+        <w:tblStyle w:val="TableGrid"/>
+        <w:tblW w:type="auto" w:w="0"/>
+        <w:jc w:val="center"/>
+        <w:tblLook w:firstColumn="1" w:firstRow="1" w:lastColumn="0" w:lastRow="0" w:noHBand="0" w:noVBand="1" w:val="04A0"/>
+      </w:tblPr>
+      <w:tblGrid>
+        <w:gridCol w:w="1512"/>
+        <w:gridCol w:w="1512"/>
+        <w:gridCol w:w="1512"/>
+        <w:gridCol w:w="1512"/>
+        <w:gridCol w:w="1512"/>
+        <w:gridCol w:w="1512"/>
+      </w:tblGrid>
+      <w:tr>
+        <w:tc>
+          <w:tcPr>
+            <w:tcW w:type="dxa" w:w="1512"/>
+            <w:shd w:val="clear" w:color="auto" w:fill="EAF1F8"/>
+          </w:tcPr>
+          <w:p>
+            <w:pPr>
+              <w:spacing w:after="40"/>
+            </w:pPr>
+            <w:r>
+              <w:rPr>
+                <w:rFonts w:ascii="Times New Roman" w:hAnsi="Times New Roman" w:eastAsia="宋体"/>
+                <w:b/>
+                <w:i w:val="0"/>
+                <w:color w:val="1F4E79"/>
+                <w:sz w:val="20"/>
+              </w:rPr>
+            </w:r>
+            <w:r>
+              <w:rPr>
+                <w:rFonts w:ascii="Times New Roman" w:hAnsi="Times New Roman" w:eastAsia="宋体"/>
+                <w:b/>
+                <w:i w:val="0"/>
+                <w:color w:val="1F4E79"/>
+                <w:sz w:val="20"/>
+              </w:rPr>
+              <w:t>#</w:t>
+            </w:r>
+          </w:p>
+        </w:tc>
+        <w:tc>
+          <w:tcPr>
+            <w:tcW w:type="dxa" w:w="1512"/>
+            <w:shd w:val="clear" w:color="auto" w:fill="EAF1F8"/>
+          </w:tcPr>
+          <w:p>
+            <w:pPr>
+              <w:spacing w:after="40"/>
+            </w:pPr>
+            <w:r>
+              <w:rPr>
+                <w:rFonts w:ascii="Times New Roman" w:hAnsi="Times New Roman" w:eastAsia="宋体"/>
+                <w:b/>
+                <w:i w:val="0"/>
+                <w:color w:val="1F4E79"/>
+                <w:sz w:val="20"/>
+              </w:rPr>
+            </w:r>
+            <w:r>
+              <w:rPr>
+                <w:rFonts w:ascii="Times New Roman" w:hAnsi="Times New Roman" w:eastAsia="宋体"/>
+                <w:b/>
+                <w:i w:val="0"/>
+                <w:color w:val="1F4E79"/>
+                <w:sz w:val="20"/>
+              </w:rPr>
+              <w:t>页面（html/）</w:t>
+            </w:r>
+          </w:p>
+        </w:tc>
+        <w:tc>
+          <w:tcPr>
+            <w:tcW w:type="dxa" w:w="1512"/>
+            <w:shd w:val="clear" w:color="auto" w:fill="EAF1F8"/>
+          </w:tcPr>
+          <w:p>
+            <w:pPr>
+              <w:spacing w:after="40"/>
+            </w:pPr>
+            <w:r>
+              <w:rPr>
+                <w:rFonts w:ascii="Times New Roman" w:hAnsi="Times New Roman" w:eastAsia="宋体"/>
+                <w:b/>
+                <w:i w:val="0"/>
+                <w:color w:val="1F4E79"/>
+                <w:sz w:val="20"/>
+              </w:rPr>
+            </w:r>
+            <w:r>
+              <w:rPr>
+                <w:rFonts w:ascii="Times New Roman" w:hAnsi="Times New Roman" w:eastAsia="宋体"/>
+                <w:b/>
+                <w:i w:val="0"/>
+                <w:color w:val="1F4E79"/>
+                <w:sz w:val="20"/>
+              </w:rPr>
+              <w:t>§4 流程</w:t>
+            </w:r>
+          </w:p>
+        </w:tc>
+        <w:tc>
+          <w:tcPr>
+            <w:tcW w:type="dxa" w:w="1512"/>
+            <w:shd w:val="clear" w:color="auto" w:fill="EAF1F8"/>
+          </w:tcPr>
+          <w:p>
+            <w:pPr>
+              <w:spacing w:after="40"/>
+            </w:pPr>
+            <w:r>
+              <w:rPr>
+                <w:rFonts w:ascii="Times New Roman" w:hAnsi="Times New Roman" w:eastAsia="宋体"/>
+                <w:b/>
+                <w:i w:val="0"/>
+                <w:color w:val="1F4E79"/>
+                <w:sz w:val="20"/>
+              </w:rPr>
+            </w:r>
+            <w:r>
+              <w:rPr>
+                <w:rFonts w:ascii="Times New Roman" w:hAnsi="Times New Roman" w:eastAsia="宋体"/>
+                <w:b/>
+                <w:i w:val="0"/>
+                <w:color w:val="1F4E79"/>
+                <w:sz w:val="20"/>
+              </w:rPr>
+              <w:t>FR</w:t>
+            </w:r>
+          </w:p>
+        </w:tc>
+        <w:tc>
+          <w:tcPr>
+            <w:tcW w:type="dxa" w:w="1512"/>
+            <w:shd w:val="clear" w:color="auto" w:fill="EAF1F8"/>
+          </w:tcPr>
+          <w:p>
+            <w:pPr>
+              <w:spacing w:after="40"/>
+            </w:pPr>
+            <w:r>
+              <w:rPr>
+                <w:rFonts w:ascii="Times New Roman" w:hAnsi="Times New Roman" w:eastAsia="宋体"/>
+                <w:b/>
+                <w:i w:val="0"/>
+                <w:color w:val="1F4E79"/>
+                <w:sz w:val="20"/>
+              </w:rPr>
+            </w:r>
+            <w:r>
+              <w:rPr>
+                <w:rFonts w:ascii="Times New Roman" w:hAnsi="Times New Roman" w:eastAsia="宋体"/>
+                <w:b/>
+                <w:i w:val="0"/>
+                <w:color w:val="1F4E79"/>
+                <w:sz w:val="20"/>
+              </w:rPr>
+              <w:t>里程碑</w:t>
+            </w:r>
+          </w:p>
+        </w:tc>
+        <w:tc>
+          <w:tcPr>
+            <w:tcW w:type="dxa" w:w="1512"/>
+            <w:shd w:val="clear" w:color="auto" w:fill="EAF1F8"/>
+          </w:tcPr>
+          <w:p>
+            <w:pPr>
+              <w:spacing w:after="40"/>
+            </w:pPr>
+            <w:r>
+              <w:rPr>
+                <w:rFonts w:ascii="Times New Roman" w:hAnsi="Times New Roman" w:eastAsia="宋体"/>
+                <w:b/>
+                <w:i w:val="0"/>
+                <w:color w:val="1F4E79"/>
+                <w:sz w:val="20"/>
+              </w:rPr>
+            </w:r>
+            <w:r>
+              <w:rPr>
+                <w:rFonts w:ascii="Times New Roman" w:hAnsi="Times New Roman" w:eastAsia="宋体"/>
+                <w:b/>
+                <w:i w:val="0"/>
+                <w:color w:val="1F4E79"/>
+                <w:sz w:val="20"/>
+              </w:rPr>
+              <w:t>说明</w:t>
+            </w:r>
+          </w:p>
+        </w:tc>
+      </w:tr>
+      <w:tr>
+        <w:tc>
+          <w:tcPr>
+            <w:tcW w:type="dxa" w:w="1512"/>
+          </w:tcPr>
+          <w:p>
+            <w:pPr>
+              <w:spacing w:after="40"/>
+            </w:pPr>
+            <w:r/>
+            <w:r>
+              <w:rPr>
+                <w:rFonts w:ascii="Times New Roman" w:hAnsi="Times New Roman" w:eastAsia="宋体"/>
+                <w:b w:val="0"/>
+                <w:i w:val="0"/>
+                <w:sz w:val="20"/>
+              </w:rPr>
+              <w:t>00</w:t>
+            </w:r>
+          </w:p>
+        </w:tc>
+        <w:tc>
+          <w:tcPr>
+            <w:tcW w:type="dxa" w:w="1512"/>
+          </w:tcPr>
+          <w:p>
+            <w:pPr>
+              <w:spacing w:after="40"/>
+            </w:pPr>
+            <w:r/>
+            <w:r>
+              <w:rPr>
+                <w:rFonts w:ascii="Times New Roman" w:hAnsi="Times New Roman" w:eastAsia="宋体"/>
+                <w:b w:val="0"/>
+                <w:i w:val="0"/>
+                <w:sz w:val="20"/>
+              </w:rPr>
+              <w:t>00_landing</w:t>
+            </w:r>
+          </w:p>
+        </w:tc>
+        <w:tc>
+          <w:tcPr>
+            <w:tcW w:type="dxa" w:w="1512"/>
+          </w:tcPr>
+          <w:p>
+            <w:pPr>
+              <w:spacing w:after="40"/>
+            </w:pPr>
+            <w:r/>
+            <w:r>
+              <w:rPr>
+                <w:rFonts w:ascii="Times New Roman" w:hAnsi="Times New Roman" w:eastAsia="宋体"/>
+                <w:b w:val="0"/>
+                <w:i w:val="0"/>
+                <w:sz w:val="20"/>
+              </w:rPr>
+              <w:t>§4.1 首学漏斗</w:t>
+            </w:r>
+          </w:p>
+        </w:tc>
+        <w:tc>
+          <w:tcPr>
+            <w:tcW w:type="dxa" w:w="1512"/>
+          </w:tcPr>
+          <w:p>
+            <w:pPr>
+              <w:spacing w:after="40"/>
+            </w:pPr>
+            <w:r/>
+            <w:r>
+              <w:rPr>
+                <w:rFonts w:ascii="Times New Roman" w:hAnsi="Times New Roman" w:eastAsia="宋体"/>
+                <w:b w:val="0"/>
+                <w:i w:val="0"/>
+                <w:sz w:val="20"/>
+              </w:rPr>
+              <w:t>FR-10</w:t>
+            </w:r>
+          </w:p>
+        </w:tc>
+        <w:tc>
+          <w:tcPr>
+            <w:tcW w:type="dxa" w:w="1512"/>
+          </w:tcPr>
+          <w:p>
+            <w:pPr>
+              <w:spacing w:after="40"/>
+            </w:pPr>
+            <w:r/>
+            <w:r>
+              <w:rPr>
+                <w:rFonts w:ascii="Times New Roman" w:hAnsi="Times New Roman" w:eastAsia="宋体"/>
+                <w:b w:val="0"/>
+                <w:i w:val="0"/>
+                <w:sz w:val="20"/>
+              </w:rPr>
+              <w:t>M2</w:t>
+            </w:r>
+          </w:p>
+        </w:tc>
+        <w:tc>
+          <w:tcPr>
+            <w:tcW w:type="dxa" w:w="1512"/>
+          </w:tcPr>
+          <w:p>
+            <w:pPr>
+              <w:spacing w:after="40"/>
+            </w:pPr>
+            <w:r/>
+            <w:r>
+              <w:rPr>
+                <w:rFonts w:ascii="Times New Roman" w:hAnsi="Times New Roman" w:eastAsia="宋体"/>
+                <w:b w:val="0"/>
+                <w:i w:val="0"/>
+                <w:sz w:val="20"/>
+              </w:rPr>
+              <w:t>落地页（游客态）</w:t>
+            </w:r>
+          </w:p>
+        </w:tc>
+      </w:tr>
+      <w:tr>
+        <w:tc>
+          <w:tcPr>
+            <w:tcW w:type="dxa" w:w="1512"/>
+          </w:tcPr>
+          <w:p>
+            <w:pPr>
+              <w:spacing w:after="40"/>
+            </w:pPr>
+            <w:r/>
+            <w:r>
+              <w:rPr>
+                <w:rFonts w:ascii="Times New Roman" w:hAnsi="Times New Roman" w:eastAsia="宋体"/>
+                <w:b w:val="0"/>
+                <w:i w:val="0"/>
+                <w:sz w:val="20"/>
+              </w:rPr>
+              <w:t>01</w:t>
+            </w:r>
+          </w:p>
+        </w:tc>
+        <w:tc>
+          <w:tcPr>
+            <w:tcW w:type="dxa" w:w="1512"/>
+          </w:tcPr>
+          <w:p>
+            <w:pPr>
+              <w:spacing w:after="40"/>
+            </w:pPr>
+            <w:r/>
+            <w:r>
+              <w:rPr>
+                <w:rFonts w:ascii="Times New Roman" w:hAnsi="Times New Roman" w:eastAsia="宋体"/>
+                <w:b w:val="0"/>
+                <w:i w:val="0"/>
+                <w:sz w:val="20"/>
+              </w:rPr>
+              <w:t>01_book_detail</w:t>
+            </w:r>
+          </w:p>
+        </w:tc>
+        <w:tc>
+          <w:tcPr>
+            <w:tcW w:type="dxa" w:w="1512"/>
+          </w:tcPr>
+          <w:p>
+            <w:pPr>
+              <w:spacing w:after="40"/>
+            </w:pPr>
+            <w:r/>
+            <w:r>
+              <w:rPr>
+                <w:rFonts w:ascii="Times New Roman" w:hAnsi="Times New Roman" w:eastAsia="宋体"/>
+                <w:b w:val="0"/>
+                <w:i w:val="0"/>
+                <w:sz w:val="20"/>
+              </w:rPr>
+              <w:t>§4.1 首学漏斗</w:t>
+            </w:r>
+          </w:p>
+        </w:tc>
+        <w:tc>
+          <w:tcPr>
+            <w:tcW w:type="dxa" w:w="1512"/>
+          </w:tcPr>
+          <w:p>
+            <w:pPr>
+              <w:spacing w:after="40"/>
+            </w:pPr>
+            <w:r/>
+            <w:r>
+              <w:rPr>
+                <w:rFonts w:ascii="Times New Roman" w:hAnsi="Times New Roman" w:eastAsia="宋体"/>
+                <w:b w:val="0"/>
+                <w:i w:val="0"/>
+                <w:sz w:val="20"/>
+              </w:rPr>
+              <w:t>FR-10</w:t>
+            </w:r>
+          </w:p>
+        </w:tc>
+        <w:tc>
+          <w:tcPr>
+            <w:tcW w:type="dxa" w:w="1512"/>
+          </w:tcPr>
+          <w:p>
+            <w:pPr>
+              <w:spacing w:after="40"/>
+            </w:pPr>
+            <w:r/>
+            <w:r>
+              <w:rPr>
+                <w:rFonts w:ascii="Times New Roman" w:hAnsi="Times New Roman" w:eastAsia="宋体"/>
+                <w:b w:val="0"/>
+                <w:i w:val="0"/>
+                <w:sz w:val="20"/>
+              </w:rPr>
+              <w:t>M2</w:t>
+            </w:r>
+          </w:p>
+        </w:tc>
+        <w:tc>
+          <w:tcPr>
+            <w:tcW w:type="dxa" w:w="1512"/>
+          </w:tcPr>
+          <w:p>
+            <w:pPr>
+              <w:spacing w:after="40"/>
+            </w:pPr>
+            <w:r/>
+            <w:r>
+              <w:rPr>
+                <w:rFonts w:ascii="Times New Roman" w:hAnsi="Times New Roman" w:eastAsia="宋体"/>
+                <w:b w:val="0"/>
+                <w:i w:val="0"/>
+                <w:sz w:val="20"/>
+              </w:rPr>
+              <w:t>词书详情（公开 / SEO）</w:t>
+            </w:r>
+          </w:p>
+        </w:tc>
+      </w:tr>
+      <w:tr>
+        <w:tc>
+          <w:tcPr>
+            <w:tcW w:type="dxa" w:w="1512"/>
+          </w:tcPr>
+          <w:p>
+            <w:pPr>
+              <w:spacing w:after="40"/>
+            </w:pPr>
+            <w:r/>
+            <w:r>
+              <w:rPr>
+                <w:rFonts w:ascii="Times New Roman" w:hAnsi="Times New Roman" w:eastAsia="宋体"/>
+                <w:b w:val="0"/>
+                <w:i w:val="0"/>
+                <w:sz w:val="20"/>
+              </w:rPr>
+              <w:t>02</w:t>
+            </w:r>
+          </w:p>
+        </w:tc>
+        <w:tc>
+          <w:tcPr>
+            <w:tcW w:type="dxa" w:w="1512"/>
+          </w:tcPr>
+          <w:p>
+            <w:pPr>
+              <w:spacing w:after="40"/>
+            </w:pPr>
+            <w:r/>
+            <w:r>
+              <w:rPr>
+                <w:rFonts w:ascii="Times New Roman" w:hAnsi="Times New Roman" w:eastAsia="宋体"/>
+                <w:b w:val="0"/>
+                <w:i w:val="0"/>
+                <w:sz w:val="20"/>
+              </w:rPr>
+              <w:t>02_guest_trial</w:t>
+            </w:r>
+          </w:p>
+        </w:tc>
+        <w:tc>
+          <w:tcPr>
+            <w:tcW w:type="dxa" w:w="1512"/>
+          </w:tcPr>
+          <w:p>
+            <w:pPr>
+              <w:spacing w:after="40"/>
+            </w:pPr>
+            <w:r/>
+            <w:r>
+              <w:rPr>
+                <w:rFonts w:ascii="Times New Roman" w:hAnsi="Times New Roman" w:eastAsia="宋体"/>
+                <w:b w:val="0"/>
+                <w:i w:val="0"/>
+                <w:sz w:val="20"/>
+              </w:rPr>
+              <w:t>§4.1 首学漏斗</w:t>
+            </w:r>
+          </w:p>
+        </w:tc>
+        <w:tc>
+          <w:tcPr>
+            <w:tcW w:type="dxa" w:w="1512"/>
+          </w:tcPr>
+          <w:p>
+            <w:pPr>
+              <w:spacing w:after="40"/>
+            </w:pPr>
+            <w:r/>
+            <w:r>
+              <w:rPr>
+                <w:rFonts w:ascii="Times New Roman" w:hAnsi="Times New Roman" w:eastAsia="宋体"/>
+                <w:b w:val="0"/>
+                <w:i w:val="0"/>
+                <w:sz w:val="20"/>
+              </w:rPr>
+              <w:t>FR-01</w:t>
+            </w:r>
+          </w:p>
+        </w:tc>
+        <w:tc>
+          <w:tcPr>
+            <w:tcW w:type="dxa" w:w="1512"/>
+          </w:tcPr>
+          <w:p>
+            <w:pPr>
+              <w:spacing w:after="40"/>
+            </w:pPr>
+            <w:r/>
+            <w:r>
+              <w:rPr>
+                <w:rFonts w:ascii="Times New Roman" w:hAnsi="Times New Roman" w:eastAsia="宋体"/>
+                <w:b w:val="0"/>
+                <w:i w:val="0"/>
+                <w:sz w:val="20"/>
+              </w:rPr>
+              <w:t>M2</w:t>
+            </w:r>
+          </w:p>
+        </w:tc>
+        <w:tc>
+          <w:tcPr>
+            <w:tcW w:type="dxa" w:w="1512"/>
+          </w:tcPr>
+          <w:p>
+            <w:pPr>
+              <w:spacing w:after="40"/>
+            </w:pPr>
+            <w:r/>
+            <w:r>
+              <w:rPr>
+                <w:rFonts w:ascii="Times New Roman" w:hAnsi="Times New Roman" w:eastAsia="宋体"/>
+                <w:b w:val="0"/>
+                <w:i w:val="0"/>
+                <w:sz w:val="20"/>
+              </w:rPr>
+              <w:t>游客试学 5 词（主嵌图）</w:t>
+            </w:r>
+          </w:p>
+        </w:tc>
+      </w:tr>
+      <w:tr>
+        <w:tc>
+          <w:tcPr>
+            <w:tcW w:type="dxa" w:w="1512"/>
+          </w:tcPr>
+          <w:p>
+            <w:pPr>
+              <w:spacing w:after="40"/>
+            </w:pPr>
+            <w:r/>
+            <w:r>
+              <w:rPr>
+                <w:rFonts w:ascii="Times New Roman" w:hAnsi="Times New Roman" w:eastAsia="宋体"/>
+                <w:b w:val="0"/>
+                <w:i w:val="0"/>
+                <w:sz w:val="20"/>
+              </w:rPr>
+              <w:t>03</w:t>
+            </w:r>
+          </w:p>
+        </w:tc>
+        <w:tc>
+          <w:tcPr>
+            <w:tcW w:type="dxa" w:w="1512"/>
+          </w:tcPr>
+          <w:p>
+            <w:pPr>
+              <w:spacing w:after="40"/>
+            </w:pPr>
+            <w:r/>
+            <w:r>
+              <w:rPr>
+                <w:rFonts w:ascii="Times New Roman" w:hAnsi="Times New Roman" w:eastAsia="宋体"/>
+                <w:b w:val="0"/>
+                <w:i w:val="0"/>
+                <w:sz w:val="20"/>
+              </w:rPr>
+              <w:t>03_signup</w:t>
+            </w:r>
+          </w:p>
+        </w:tc>
+        <w:tc>
+          <w:tcPr>
+            <w:tcW w:type="dxa" w:w="1512"/>
+          </w:tcPr>
+          <w:p>
+            <w:pPr>
+              <w:spacing w:after="40"/>
+            </w:pPr>
+            <w:r/>
+            <w:r>
+              <w:rPr>
+                <w:rFonts w:ascii="Times New Roman" w:hAnsi="Times New Roman" w:eastAsia="宋体"/>
+                <w:b w:val="0"/>
+                <w:i w:val="0"/>
+                <w:sz w:val="20"/>
+              </w:rPr>
+              <w:t>§4.1 首学漏斗</w:t>
+            </w:r>
+          </w:p>
+        </w:tc>
+        <w:tc>
+          <w:tcPr>
+            <w:tcW w:type="dxa" w:w="1512"/>
+          </w:tcPr>
+          <w:p>
+            <w:pPr>
+              <w:spacing w:after="40"/>
+            </w:pPr>
+            <w:r/>
+            <w:r>
+              <w:rPr>
+                <w:rFonts w:ascii="Times New Roman" w:hAnsi="Times New Roman" w:eastAsia="宋体"/>
+                <w:b w:val="0"/>
+                <w:i w:val="0"/>
+                <w:sz w:val="20"/>
+              </w:rPr>
+              <w:t>FR-01</w:t>
+            </w:r>
+          </w:p>
+        </w:tc>
+        <w:tc>
+          <w:tcPr>
+            <w:tcW w:type="dxa" w:w="1512"/>
+          </w:tcPr>
+          <w:p>
+            <w:pPr>
+              <w:spacing w:after="40"/>
+            </w:pPr>
+            <w:r/>
+            <w:r>
+              <w:rPr>
+                <w:rFonts w:ascii="Times New Roman" w:hAnsi="Times New Roman" w:eastAsia="宋体"/>
+                <w:b w:val="0"/>
+                <w:i w:val="0"/>
+                <w:sz w:val="20"/>
+              </w:rPr>
+              <w:t>M2</w:t>
+            </w:r>
+          </w:p>
+        </w:tc>
+        <w:tc>
+          <w:tcPr>
+            <w:tcW w:type="dxa" w:w="1512"/>
+          </w:tcPr>
+          <w:p>
+            <w:pPr>
+              <w:spacing w:after="40"/>
+            </w:pPr>
+            <w:r/>
+            <w:r>
+              <w:rPr>
+                <w:rFonts w:ascii="Times New Roman" w:hAnsi="Times New Roman" w:eastAsia="宋体"/>
+                <w:b w:val="0"/>
+                <w:i w:val="0"/>
+                <w:sz w:val="20"/>
+              </w:rPr>
+              <w:t>注册（游客进度合并）</w:t>
+            </w:r>
+          </w:p>
+        </w:tc>
+      </w:tr>
+      <w:tr>
+        <w:tc>
+          <w:tcPr>
+            <w:tcW w:type="dxa" w:w="1512"/>
+          </w:tcPr>
+          <w:p>
+            <w:pPr>
+              <w:spacing w:after="40"/>
+            </w:pPr>
+            <w:r/>
+            <w:r>
+              <w:rPr>
+                <w:rFonts w:ascii="Times New Roman" w:hAnsi="Times New Roman" w:eastAsia="宋体"/>
+                <w:b w:val="0"/>
+                <w:i w:val="0"/>
+                <w:sz w:val="20"/>
+              </w:rPr>
+              <w:t>04</w:t>
+            </w:r>
+          </w:p>
+        </w:tc>
+        <w:tc>
+          <w:tcPr>
+            <w:tcW w:type="dxa" w:w="1512"/>
+          </w:tcPr>
+          <w:p>
+            <w:pPr>
+              <w:spacing w:after="40"/>
+            </w:pPr>
+            <w:r/>
+            <w:r>
+              <w:rPr>
+                <w:rFonts w:ascii="Times New Roman" w:hAnsi="Times New Roman" w:eastAsia="宋体"/>
+                <w:b w:val="0"/>
+                <w:i w:val="0"/>
+                <w:sz w:val="20"/>
+              </w:rPr>
+              <w:t>04_login</w:t>
+            </w:r>
+          </w:p>
+        </w:tc>
+        <w:tc>
+          <w:tcPr>
+            <w:tcW w:type="dxa" w:w="1512"/>
+          </w:tcPr>
+          <w:p>
+            <w:pPr>
+              <w:spacing w:after="40"/>
+            </w:pPr>
+            <w:r/>
+            <w:r>
+              <w:rPr>
+                <w:rFonts w:ascii="Times New Roman" w:hAnsi="Times New Roman" w:eastAsia="宋体"/>
+                <w:b w:val="0"/>
+                <w:i w:val="0"/>
+                <w:sz w:val="20"/>
+              </w:rPr>
+              <w:t>§4.1 首学漏斗</w:t>
+            </w:r>
+          </w:p>
+        </w:tc>
+        <w:tc>
+          <w:tcPr>
+            <w:tcW w:type="dxa" w:w="1512"/>
+          </w:tcPr>
+          <w:p>
+            <w:pPr>
+              <w:spacing w:after="40"/>
+            </w:pPr>
+            <w:r/>
+            <w:r>
+              <w:rPr>
+                <w:rFonts w:ascii="Times New Roman" w:hAnsi="Times New Roman" w:eastAsia="宋体"/>
+                <w:b w:val="0"/>
+                <w:i w:val="0"/>
+                <w:sz w:val="20"/>
+              </w:rPr>
+              <w:t>FR-01</w:t>
+            </w:r>
+          </w:p>
+        </w:tc>
+        <w:tc>
+          <w:tcPr>
+            <w:tcW w:type="dxa" w:w="1512"/>
+          </w:tcPr>
+          <w:p>
+            <w:pPr>
+              <w:spacing w:after="40"/>
+            </w:pPr>
+            <w:r/>
+            <w:r>
+              <w:rPr>
+                <w:rFonts w:ascii="Times New Roman" w:hAnsi="Times New Roman" w:eastAsia="宋体"/>
+                <w:b w:val="0"/>
+                <w:i w:val="0"/>
+                <w:sz w:val="20"/>
+              </w:rPr>
+              <w:t>M2</w:t>
+            </w:r>
+          </w:p>
+        </w:tc>
+        <w:tc>
+          <w:tcPr>
+            <w:tcW w:type="dxa" w:w="1512"/>
+          </w:tcPr>
+          <w:p>
+            <w:pPr>
+              <w:spacing w:after="40"/>
+            </w:pPr>
+            <w:r/>
+            <w:r>
+              <w:rPr>
+                <w:rFonts w:ascii="Times New Roman" w:hAnsi="Times New Roman" w:eastAsia="宋体"/>
+                <w:b w:val="0"/>
+                <w:i w:val="0"/>
+                <w:sz w:val="20"/>
+              </w:rPr>
+              <w:t>登录</w:t>
+            </w:r>
+          </w:p>
+        </w:tc>
+      </w:tr>
+      <w:tr>
+        <w:tc>
+          <w:tcPr>
+            <w:tcW w:type="dxa" w:w="1512"/>
+          </w:tcPr>
+          <w:p>
+            <w:pPr>
+              <w:spacing w:after="40"/>
+            </w:pPr>
+            <w:r/>
+            <w:r>
+              <w:rPr>
+                <w:rFonts w:ascii="Times New Roman" w:hAnsi="Times New Roman" w:eastAsia="宋体"/>
+                <w:b w:val="0"/>
+                <w:i w:val="0"/>
+                <w:sz w:val="20"/>
+              </w:rPr>
+              <w:t>05</w:t>
+            </w:r>
+          </w:p>
+        </w:tc>
+        <w:tc>
+          <w:tcPr>
+            <w:tcW w:type="dxa" w:w="1512"/>
+          </w:tcPr>
+          <w:p>
+            <w:pPr>
+              <w:spacing w:after="40"/>
+            </w:pPr>
+            <w:r/>
+            <w:r>
+              <w:rPr>
+                <w:rFonts w:ascii="Times New Roman" w:hAnsi="Times New Roman" w:eastAsia="宋体"/>
+                <w:b w:val="0"/>
+                <w:i w:val="0"/>
+                <w:sz w:val="20"/>
+              </w:rPr>
+              <w:t>05_onboarding</w:t>
+            </w:r>
+          </w:p>
+        </w:tc>
+        <w:tc>
+          <w:tcPr>
+            <w:tcW w:type="dxa" w:w="1512"/>
+          </w:tcPr>
+          <w:p>
+            <w:pPr>
+              <w:spacing w:after="40"/>
+            </w:pPr>
+            <w:r/>
+            <w:r>
+              <w:rPr>
+                <w:rFonts w:ascii="Times New Roman" w:hAnsi="Times New Roman" w:eastAsia="宋体"/>
+                <w:b w:val="0"/>
+                <w:i w:val="0"/>
+                <w:sz w:val="20"/>
+              </w:rPr>
+              <w:t>§4.1 首学漏斗</w:t>
+            </w:r>
+          </w:p>
+        </w:tc>
+        <w:tc>
+          <w:tcPr>
+            <w:tcW w:type="dxa" w:w="1512"/>
+          </w:tcPr>
+          <w:p>
+            <w:pPr>
+              <w:spacing w:after="40"/>
+            </w:pPr>
+            <w:r/>
+            <w:r>
+              <w:rPr>
+                <w:rFonts w:ascii="Times New Roman" w:hAnsi="Times New Roman" w:eastAsia="宋体"/>
+                <w:b w:val="0"/>
+                <w:i w:val="0"/>
+                <w:sz w:val="20"/>
+              </w:rPr>
+              <w:t>FR-02</w:t>
+            </w:r>
+          </w:p>
+        </w:tc>
+        <w:tc>
+          <w:tcPr>
+            <w:tcW w:type="dxa" w:w="1512"/>
+          </w:tcPr>
+          <w:p>
+            <w:pPr>
+              <w:spacing w:after="40"/>
+            </w:pPr>
+            <w:r/>
+            <w:r>
+              <w:rPr>
+                <w:rFonts w:ascii="Times New Roman" w:hAnsi="Times New Roman" w:eastAsia="宋体"/>
+                <w:b w:val="0"/>
+                <w:i w:val="0"/>
+                <w:sz w:val="20"/>
+              </w:rPr>
+              <w:t>M2</w:t>
+            </w:r>
+          </w:p>
+        </w:tc>
+        <w:tc>
+          <w:tcPr>
+            <w:tcW w:type="dxa" w:w="1512"/>
+          </w:tcPr>
+          <w:p>
+            <w:pPr>
+              <w:spacing w:after="40"/>
+            </w:pPr>
+            <w:r/>
+            <w:r>
+              <w:rPr>
+                <w:rFonts w:ascii="Times New Roman" w:hAnsi="Times New Roman" w:eastAsia="宋体"/>
+                <w:b w:val="0"/>
+                <w:i w:val="0"/>
+                <w:sz w:val="20"/>
+              </w:rPr>
+              <w:t>首次设置向导</w:t>
+            </w:r>
+          </w:p>
+        </w:tc>
+      </w:tr>
+      <w:tr>
+        <w:tc>
+          <w:tcPr>
+            <w:tcW w:type="dxa" w:w="1512"/>
+          </w:tcPr>
+          <w:p>
+            <w:pPr>
+              <w:spacing w:after="40"/>
+            </w:pPr>
+            <w:r/>
+            <w:r>
+              <w:rPr>
+                <w:rFonts w:ascii="Times New Roman" w:hAnsi="Times New Roman" w:eastAsia="宋体"/>
+                <w:b w:val="0"/>
+                <w:i w:val="0"/>
+                <w:sz w:val="20"/>
+              </w:rPr>
+              <w:t>06</w:t>
+            </w:r>
+          </w:p>
+        </w:tc>
+        <w:tc>
+          <w:tcPr>
+            <w:tcW w:type="dxa" w:w="1512"/>
+          </w:tcPr>
+          <w:p>
+            <w:pPr>
+              <w:spacing w:after="40"/>
+            </w:pPr>
+            <w:r/>
+            <w:r>
+              <w:rPr>
+                <w:rFonts w:ascii="Times New Roman" w:hAnsi="Times New Roman" w:eastAsia="宋体"/>
+                <w:b w:val="0"/>
+                <w:i w:val="0"/>
+                <w:sz w:val="20"/>
+              </w:rPr>
+              <w:t>06_today</w:t>
+            </w:r>
+          </w:p>
+        </w:tc>
+        <w:tc>
+          <w:tcPr>
+            <w:tcW w:type="dxa" w:w="1512"/>
+          </w:tcPr>
+          <w:p>
+            <w:pPr>
+              <w:spacing w:after="40"/>
+            </w:pPr>
+            <w:r/>
+            <w:r>
+              <w:rPr>
+                <w:rFonts w:ascii="Times New Roman" w:hAnsi="Times New Roman" w:eastAsia="宋体"/>
+                <w:b w:val="0"/>
+                <w:i w:val="0"/>
+                <w:sz w:val="20"/>
+              </w:rPr>
+              <w:t>§4.2 每日学习</w:t>
+            </w:r>
+          </w:p>
+        </w:tc>
+        <w:tc>
+          <w:tcPr>
+            <w:tcW w:type="dxa" w:w="1512"/>
+          </w:tcPr>
+          <w:p>
+            <w:pPr>
+              <w:spacing w:after="40"/>
+            </w:pPr>
+            <w:r/>
+            <w:r>
+              <w:rPr>
+                <w:rFonts w:ascii="Times New Roman" w:hAnsi="Times New Roman" w:eastAsia="宋体"/>
+                <w:b w:val="0"/>
+                <w:i w:val="0"/>
+                <w:sz w:val="20"/>
+              </w:rPr>
+              <w:t>FR-03 / FR-08</w:t>
+            </w:r>
+          </w:p>
+        </w:tc>
+        <w:tc>
+          <w:tcPr>
+            <w:tcW w:type="dxa" w:w="1512"/>
+          </w:tcPr>
+          <w:p>
+            <w:pPr>
+              <w:spacing w:after="40"/>
+            </w:pPr>
+            <w:r/>
+            <w:r>
+              <w:rPr>
+                <w:rFonts w:ascii="Times New Roman" w:hAnsi="Times New Roman" w:eastAsia="宋体"/>
+                <w:b w:val="0"/>
+                <w:i w:val="0"/>
+                <w:sz w:val="20"/>
+              </w:rPr>
+              <w:t>M2 / M3</w:t>
+            </w:r>
+          </w:p>
+        </w:tc>
+        <w:tc>
+          <w:tcPr>
+            <w:tcW w:type="dxa" w:w="1512"/>
+          </w:tcPr>
+          <w:p>
+            <w:pPr>
+              <w:spacing w:after="40"/>
+            </w:pPr>
+            <w:r/>
+            <w:r>
+              <w:rPr>
+                <w:rFonts w:ascii="Times New Roman" w:hAnsi="Times New Roman" w:eastAsia="宋体"/>
+                <w:b w:val="0"/>
+                <w:i w:val="0"/>
+                <w:sz w:val="20"/>
+              </w:rPr>
+              <w:t>今日首页（主嵌图）</w:t>
+            </w:r>
+          </w:p>
+        </w:tc>
+      </w:tr>
+      <w:tr>
+        <w:tc>
+          <w:tcPr>
+            <w:tcW w:type="dxa" w:w="1512"/>
+          </w:tcPr>
+          <w:p>
+            <w:pPr>
+              <w:spacing w:after="40"/>
+            </w:pPr>
+            <w:r/>
+            <w:r>
+              <w:rPr>
+                <w:rFonts w:ascii="Times New Roman" w:hAnsi="Times New Roman" w:eastAsia="宋体"/>
+                <w:b w:val="0"/>
+                <w:i w:val="0"/>
+                <w:sz w:val="20"/>
+              </w:rPr>
+              <w:t>07</w:t>
+            </w:r>
+          </w:p>
+        </w:tc>
+        <w:tc>
+          <w:tcPr>
+            <w:tcW w:type="dxa" w:w="1512"/>
+          </w:tcPr>
+          <w:p>
+            <w:pPr>
+              <w:spacing w:after="40"/>
+            </w:pPr>
+            <w:r/>
+            <w:r>
+              <w:rPr>
+                <w:rFonts w:ascii="Times New Roman" w:hAnsi="Times New Roman" w:eastAsia="宋体"/>
+                <w:b w:val="0"/>
+                <w:i w:val="0"/>
+                <w:sz w:val="20"/>
+              </w:rPr>
+              <w:t>07_new_word</w:t>
+            </w:r>
+          </w:p>
+        </w:tc>
+        <w:tc>
+          <w:tcPr>
+            <w:tcW w:type="dxa" w:w="1512"/>
+          </w:tcPr>
+          <w:p>
+            <w:pPr>
+              <w:spacing w:after="40"/>
+            </w:pPr>
+            <w:r/>
+            <w:r>
+              <w:rPr>
+                <w:rFonts w:ascii="Times New Roman" w:hAnsi="Times New Roman" w:eastAsia="宋体"/>
+                <w:b w:val="0"/>
+                <w:i w:val="0"/>
+                <w:sz w:val="20"/>
+              </w:rPr>
+              <w:t>§4.3 新词自评</w:t>
+            </w:r>
+          </w:p>
+        </w:tc>
+        <w:tc>
+          <w:tcPr>
+            <w:tcW w:type="dxa" w:w="1512"/>
+          </w:tcPr>
+          <w:p>
+            <w:pPr>
+              <w:spacing w:after="40"/>
+            </w:pPr>
+            <w:r/>
+            <w:r>
+              <w:rPr>
+                <w:rFonts w:ascii="Times New Roman" w:hAnsi="Times New Roman" w:eastAsia="宋体"/>
+                <w:b w:val="0"/>
+                <w:i w:val="0"/>
+                <w:sz w:val="20"/>
+              </w:rPr>
+              <w:t>FR-04</w:t>
+            </w:r>
+          </w:p>
+        </w:tc>
+        <w:tc>
+          <w:tcPr>
+            <w:tcW w:type="dxa" w:w="1512"/>
+          </w:tcPr>
+          <w:p>
+            <w:pPr>
+              <w:spacing w:after="40"/>
+            </w:pPr>
+            <w:r/>
+            <w:r>
+              <w:rPr>
+                <w:rFonts w:ascii="Times New Roman" w:hAnsi="Times New Roman" w:eastAsia="宋体"/>
+                <w:b w:val="0"/>
+                <w:i w:val="0"/>
+                <w:sz w:val="20"/>
+              </w:rPr>
+              <w:t>M2</w:t>
+            </w:r>
+          </w:p>
+        </w:tc>
+        <w:tc>
+          <w:tcPr>
+            <w:tcW w:type="dxa" w:w="1512"/>
+          </w:tcPr>
+          <w:p>
+            <w:pPr>
+              <w:spacing w:after="40"/>
+            </w:pPr>
+            <w:r/>
+            <w:r>
+              <w:rPr>
+                <w:rFonts w:ascii="Times New Roman" w:hAnsi="Times New Roman" w:eastAsia="宋体"/>
+                <w:b w:val="0"/>
+                <w:i w:val="0"/>
+                <w:sz w:val="20"/>
+              </w:rPr>
+              <w:t>新词卡片 + 三态自评（主嵌图）</w:t>
+            </w:r>
+          </w:p>
+        </w:tc>
+      </w:tr>
+      <w:tr>
+        <w:tc>
+          <w:tcPr>
+            <w:tcW w:type="dxa" w:w="1512"/>
+          </w:tcPr>
+          <w:p>
+            <w:pPr>
+              <w:spacing w:after="40"/>
+            </w:pPr>
+            <w:r/>
+            <w:r>
+              <w:rPr>
+                <w:rFonts w:ascii="Times New Roman" w:hAnsi="Times New Roman" w:eastAsia="宋体"/>
+                <w:b w:val="0"/>
+                <w:i w:val="0"/>
+                <w:sz w:val="20"/>
+              </w:rPr>
+              <w:t>08</w:t>
+            </w:r>
+          </w:p>
+        </w:tc>
+        <w:tc>
+          <w:tcPr>
+            <w:tcW w:type="dxa" w:w="1512"/>
+          </w:tcPr>
+          <w:p>
+            <w:pPr>
+              <w:spacing w:after="40"/>
+            </w:pPr>
+            <w:r/>
+            <w:r>
+              <w:rPr>
+                <w:rFonts w:ascii="Times New Roman" w:hAnsi="Times New Roman" w:eastAsia="宋体"/>
+                <w:b w:val="0"/>
+                <w:i w:val="0"/>
+                <w:sz w:val="20"/>
+              </w:rPr>
+              <w:t>08_review</w:t>
+            </w:r>
+          </w:p>
+        </w:tc>
+        <w:tc>
+          <w:tcPr>
+            <w:tcW w:type="dxa" w:w="1512"/>
+          </w:tcPr>
+          <w:p>
+            <w:pPr>
+              <w:spacing w:after="40"/>
+            </w:pPr>
+            <w:r/>
+            <w:r>
+              <w:rPr>
+                <w:rFonts w:ascii="Times New Roman" w:hAnsi="Times New Roman" w:eastAsia="宋体"/>
+                <w:b w:val="0"/>
+                <w:i w:val="0"/>
+                <w:sz w:val="20"/>
+              </w:rPr>
+              <w:t>§4.4 复习决策</w:t>
+            </w:r>
+          </w:p>
+        </w:tc>
+        <w:tc>
+          <w:tcPr>
+            <w:tcW w:type="dxa" w:w="1512"/>
+          </w:tcPr>
+          <w:p>
+            <w:pPr>
+              <w:spacing w:after="40"/>
+            </w:pPr>
+            <w:r/>
+            <w:r>
+              <w:rPr>
+                <w:rFonts w:ascii="Times New Roman" w:hAnsi="Times New Roman" w:eastAsia="宋体"/>
+                <w:b w:val="0"/>
+                <w:i w:val="0"/>
+                <w:sz w:val="20"/>
+              </w:rPr>
+              <w:t>FR-05 / FR-06</w:t>
+            </w:r>
+          </w:p>
+        </w:tc>
+        <w:tc>
+          <w:tcPr>
+            <w:tcW w:type="dxa" w:w="1512"/>
+          </w:tcPr>
+          <w:p>
+            <w:pPr>
+              <w:spacing w:after="40"/>
+            </w:pPr>
+            <w:r/>
+            <w:r>
+              <w:rPr>
+                <w:rFonts w:ascii="Times New Roman" w:hAnsi="Times New Roman" w:eastAsia="宋体"/>
+                <w:b w:val="0"/>
+                <w:i w:val="0"/>
+                <w:sz w:val="20"/>
+              </w:rPr>
+              <w:t>M3</w:t>
+            </w:r>
+          </w:p>
+        </w:tc>
+        <w:tc>
+          <w:tcPr>
+            <w:tcW w:type="dxa" w:w="1512"/>
+          </w:tcPr>
+          <w:p>
+            <w:pPr>
+              <w:spacing w:after="40"/>
+            </w:pPr>
+            <w:r/>
+            <w:r>
+              <w:rPr>
+                <w:rFonts w:ascii="Times New Roman" w:hAnsi="Times New Roman" w:eastAsia="宋体"/>
+                <w:b w:val="0"/>
+                <w:i w:val="0"/>
+                <w:sz w:val="20"/>
+              </w:rPr>
+              <w:t>复习四选一（主嵌图）</w:t>
+            </w:r>
+          </w:p>
+        </w:tc>
+      </w:tr>
+      <w:tr>
+        <w:tc>
+          <w:tcPr>
+            <w:tcW w:type="dxa" w:w="1512"/>
+          </w:tcPr>
+          <w:p>
+            <w:pPr>
+              <w:spacing w:after="40"/>
+            </w:pPr>
+            <w:r/>
+            <w:r>
+              <w:rPr>
+                <w:rFonts w:ascii="Times New Roman" w:hAnsi="Times New Roman" w:eastAsia="宋体"/>
+                <w:b w:val="0"/>
+                <w:i w:val="0"/>
+                <w:sz w:val="20"/>
+              </w:rPr>
+              <w:t>09</w:t>
+            </w:r>
+          </w:p>
+        </w:tc>
+        <w:tc>
+          <w:tcPr>
+            <w:tcW w:type="dxa" w:w="1512"/>
+          </w:tcPr>
+          <w:p>
+            <w:pPr>
+              <w:spacing w:after="40"/>
+            </w:pPr>
+            <w:r/>
+            <w:r>
+              <w:rPr>
+                <w:rFonts w:ascii="Times New Roman" w:hAnsi="Times New Roman" w:eastAsia="宋体"/>
+                <w:b w:val="0"/>
+                <w:i w:val="0"/>
+                <w:sz w:val="20"/>
+              </w:rPr>
+              <w:t>09_done</w:t>
+            </w:r>
+          </w:p>
+        </w:tc>
+        <w:tc>
+          <w:tcPr>
+            <w:tcW w:type="dxa" w:w="1512"/>
+          </w:tcPr>
+          <w:p>
+            <w:pPr>
+              <w:spacing w:after="40"/>
+            </w:pPr>
+            <w:r/>
+            <w:r>
+              <w:rPr>
+                <w:rFonts w:ascii="Times New Roman" w:hAnsi="Times New Roman" w:eastAsia="宋体"/>
+                <w:b w:val="0"/>
+                <w:i w:val="0"/>
+                <w:sz w:val="20"/>
+              </w:rPr>
+              <w:t>§4.2 每日学习</w:t>
+            </w:r>
+          </w:p>
+        </w:tc>
+        <w:tc>
+          <w:tcPr>
+            <w:tcW w:type="dxa" w:w="1512"/>
+          </w:tcPr>
+          <w:p>
+            <w:pPr>
+              <w:spacing w:after="40"/>
+            </w:pPr>
+            <w:r/>
+            <w:r>
+              <w:rPr>
+                <w:rFonts w:ascii="Times New Roman" w:hAnsi="Times New Roman" w:eastAsia="宋体"/>
+                <w:b w:val="0"/>
+                <w:i w:val="0"/>
+                <w:sz w:val="20"/>
+              </w:rPr>
+              <w:t>FR-08</w:t>
+            </w:r>
+          </w:p>
+        </w:tc>
+        <w:tc>
+          <w:tcPr>
+            <w:tcW w:type="dxa" w:w="1512"/>
+          </w:tcPr>
+          <w:p>
+            <w:pPr>
+              <w:spacing w:after="40"/>
+            </w:pPr>
+            <w:r/>
+            <w:r>
+              <w:rPr>
+                <w:rFonts w:ascii="Times New Roman" w:hAnsi="Times New Roman" w:eastAsia="宋体"/>
+                <w:b w:val="0"/>
+                <w:i w:val="0"/>
+                <w:sz w:val="20"/>
+              </w:rPr>
+              <w:t>M3</w:t>
+            </w:r>
+          </w:p>
+        </w:tc>
+        <w:tc>
+          <w:tcPr>
+            <w:tcW w:type="dxa" w:w="1512"/>
+          </w:tcPr>
+          <w:p>
+            <w:pPr>
+              <w:spacing w:after="40"/>
+            </w:pPr>
+            <w:r/>
+            <w:r>
+              <w:rPr>
+                <w:rFonts w:ascii="Times New Roman" w:hAnsi="Times New Roman" w:eastAsia="宋体"/>
+                <w:b w:val="0"/>
+                <w:i w:val="0"/>
+                <w:sz w:val="20"/>
+              </w:rPr>
+              <w:t>当日完成 / 打卡</w:t>
+            </w:r>
+          </w:p>
+        </w:tc>
+      </w:tr>
+      <w:tr>
+        <w:tc>
+          <w:tcPr>
+            <w:tcW w:type="dxa" w:w="1512"/>
+          </w:tcPr>
+          <w:p>
+            <w:pPr>
+              <w:spacing w:after="40"/>
+            </w:pPr>
+            <w:r/>
+            <w:r>
+              <w:rPr>
+                <w:rFonts w:ascii="Times New Roman" w:hAnsi="Times New Roman" w:eastAsia="宋体"/>
+                <w:b w:val="0"/>
+                <w:i w:val="0"/>
+                <w:sz w:val="20"/>
+              </w:rPr>
+              <w:t>10</w:t>
+            </w:r>
+          </w:p>
+        </w:tc>
+        <w:tc>
+          <w:tcPr>
+            <w:tcW w:type="dxa" w:w="1512"/>
+          </w:tcPr>
+          <w:p>
+            <w:pPr>
+              <w:spacing w:after="40"/>
+            </w:pPr>
+            <w:r/>
+            <w:r>
+              <w:rPr>
+                <w:rFonts w:ascii="Times New Roman" w:hAnsi="Times New Roman" w:eastAsia="宋体"/>
+                <w:b w:val="0"/>
+                <w:i w:val="0"/>
+                <w:sz w:val="20"/>
+              </w:rPr>
+              <w:t>10_backlog</w:t>
+            </w:r>
+          </w:p>
+        </w:tc>
+        <w:tc>
+          <w:tcPr>
+            <w:tcW w:type="dxa" w:w="1512"/>
+          </w:tcPr>
+          <w:p>
+            <w:pPr>
+              <w:spacing w:after="40"/>
+            </w:pPr>
+            <w:r/>
+            <w:r>
+              <w:rPr>
+                <w:rFonts w:ascii="Times New Roman" w:hAnsi="Times New Roman" w:eastAsia="宋体"/>
+                <w:b w:val="0"/>
+                <w:i w:val="0"/>
+                <w:sz w:val="20"/>
+              </w:rPr>
+              <w:t>§4.5 缺席容错</w:t>
+            </w:r>
+          </w:p>
+        </w:tc>
+        <w:tc>
+          <w:tcPr>
+            <w:tcW w:type="dxa" w:w="1512"/>
+          </w:tcPr>
+          <w:p>
+            <w:pPr>
+              <w:spacing w:after="40"/>
+            </w:pPr>
+            <w:r/>
+            <w:r>
+              <w:rPr>
+                <w:rFonts w:ascii="Times New Roman" w:hAnsi="Times New Roman" w:eastAsia="宋体"/>
+                <w:b w:val="0"/>
+                <w:i w:val="0"/>
+                <w:sz w:val="20"/>
+              </w:rPr>
+              <w:t>FR-07</w:t>
+            </w:r>
+          </w:p>
+        </w:tc>
+        <w:tc>
+          <w:tcPr>
+            <w:tcW w:type="dxa" w:w="1512"/>
+          </w:tcPr>
+          <w:p>
+            <w:pPr>
+              <w:spacing w:after="40"/>
+            </w:pPr>
+            <w:r/>
+            <w:r>
+              <w:rPr>
+                <w:rFonts w:ascii="Times New Roman" w:hAnsi="Times New Roman" w:eastAsia="宋体"/>
+                <w:b w:val="0"/>
+                <w:i w:val="0"/>
+                <w:sz w:val="20"/>
+              </w:rPr>
+              <w:t>M3</w:t>
+            </w:r>
+          </w:p>
+        </w:tc>
+        <w:tc>
+          <w:tcPr>
+            <w:tcW w:type="dxa" w:w="1512"/>
+          </w:tcPr>
+          <w:p>
+            <w:pPr>
+              <w:spacing w:after="40"/>
+            </w:pPr>
+            <w:r/>
+            <w:r>
+              <w:rPr>
+                <w:rFonts w:ascii="Times New Roman" w:hAnsi="Times New Roman" w:eastAsia="宋体"/>
+                <w:b w:val="0"/>
+                <w:i w:val="0"/>
+                <w:sz w:val="20"/>
+              </w:rPr>
+              <w:t>缺席回归分批容错（主嵌图）</w:t>
+            </w:r>
+          </w:p>
+        </w:tc>
+      </w:tr>
+      <w:tr>
+        <w:tc>
+          <w:tcPr>
+            <w:tcW w:type="dxa" w:w="1512"/>
+          </w:tcPr>
+          <w:p>
+            <w:pPr>
+              <w:spacing w:after="40"/>
+            </w:pPr>
+            <w:r/>
+            <w:r>
+              <w:rPr>
+                <w:rFonts w:ascii="Times New Roman" w:hAnsi="Times New Roman" w:eastAsia="宋体"/>
+                <w:b w:val="0"/>
+                <w:i w:val="0"/>
+                <w:sz w:val="20"/>
+              </w:rPr>
+              <w:t>11</w:t>
+            </w:r>
+          </w:p>
+        </w:tc>
+        <w:tc>
+          <w:tcPr>
+            <w:tcW w:type="dxa" w:w="1512"/>
+          </w:tcPr>
+          <w:p>
+            <w:pPr>
+              <w:spacing w:after="40"/>
+            </w:pPr>
+            <w:r/>
+            <w:r>
+              <w:rPr>
+                <w:rFonts w:ascii="Times New Roman" w:hAnsi="Times New Roman" w:eastAsia="宋体"/>
+                <w:b w:val="0"/>
+                <w:i w:val="0"/>
+                <w:sz w:val="20"/>
+              </w:rPr>
+              <w:t>11_stats</w:t>
+            </w:r>
+          </w:p>
+        </w:tc>
+        <w:tc>
+          <w:tcPr>
+            <w:tcW w:type="dxa" w:w="1512"/>
+          </w:tcPr>
+          <w:p>
+            <w:pPr>
+              <w:spacing w:after="40"/>
+            </w:pPr>
+            <w:r/>
+            <w:r>
+              <w:rPr>
+                <w:rFonts w:ascii="Times New Roman" w:hAnsi="Times New Roman" w:eastAsia="宋体"/>
+                <w:b w:val="0"/>
+                <w:i w:val="0"/>
+                <w:sz w:val="20"/>
+              </w:rPr>
+              <w:t>—</w:t>
+            </w:r>
+          </w:p>
+        </w:tc>
+        <w:tc>
+          <w:tcPr>
+            <w:tcW w:type="dxa" w:w="1512"/>
+          </w:tcPr>
+          <w:p>
+            <w:pPr>
+              <w:spacing w:after="40"/>
+            </w:pPr>
+            <w:r/>
+            <w:r>
+              <w:rPr>
+                <w:rFonts w:ascii="Times New Roman" w:hAnsi="Times New Roman" w:eastAsia="宋体"/>
+                <w:b w:val="0"/>
+                <w:i w:val="0"/>
+                <w:sz w:val="20"/>
+              </w:rPr>
+              <w:t>FR-09</w:t>
+            </w:r>
+          </w:p>
+        </w:tc>
+        <w:tc>
+          <w:tcPr>
+            <w:tcW w:type="dxa" w:w="1512"/>
+          </w:tcPr>
+          <w:p>
+            <w:pPr>
+              <w:spacing w:after="40"/>
+            </w:pPr>
+            <w:r/>
+            <w:r>
+              <w:rPr>
+                <w:rFonts w:ascii="Times New Roman" w:hAnsi="Times New Roman" w:eastAsia="宋体"/>
+                <w:b w:val="0"/>
+                <w:i w:val="0"/>
+                <w:sz w:val="20"/>
+              </w:rPr>
+              <w:t>M3</w:t>
+            </w:r>
+          </w:p>
+        </w:tc>
+        <w:tc>
+          <w:tcPr>
+            <w:tcW w:type="dxa" w:w="1512"/>
+          </w:tcPr>
+          <w:p>
+            <w:pPr>
+              <w:spacing w:after="40"/>
+            </w:pPr>
+            <w:r/>
+            <w:r>
+              <w:rPr>
+                <w:rFonts w:ascii="Times New Roman" w:hAnsi="Times New Roman" w:eastAsia="宋体"/>
+                <w:b w:val="0"/>
+                <w:i w:val="0"/>
+                <w:sz w:val="20"/>
+              </w:rPr>
+              <w:t>进度统计 + 热力图 + 间隔表</w:t>
+            </w:r>
+          </w:p>
+        </w:tc>
+      </w:tr>
+      <w:tr>
+        <w:tc>
+          <w:tcPr>
+            <w:tcW w:type="dxa" w:w="1512"/>
+          </w:tcPr>
+          <w:p>
+            <w:pPr>
+              <w:spacing w:after="40"/>
+            </w:pPr>
+            <w:r/>
+            <w:r>
+              <w:rPr>
+                <w:rFonts w:ascii="Times New Roman" w:hAnsi="Times New Roman" w:eastAsia="宋体"/>
+                <w:b w:val="0"/>
+                <w:i w:val="0"/>
+                <w:sz w:val="20"/>
+              </w:rPr>
+              <w:t>12</w:t>
+            </w:r>
+          </w:p>
+        </w:tc>
+        <w:tc>
+          <w:tcPr>
+            <w:tcW w:type="dxa" w:w="1512"/>
+          </w:tcPr>
+          <w:p>
+            <w:pPr>
+              <w:spacing w:after="40"/>
+            </w:pPr>
+            <w:r/>
+            <w:r>
+              <w:rPr>
+                <w:rFonts w:ascii="Times New Roman" w:hAnsi="Times New Roman" w:eastAsia="宋体"/>
+                <w:b w:val="0"/>
+                <w:i w:val="0"/>
+                <w:sz w:val="20"/>
+              </w:rPr>
+              <w:t>12_settings</w:t>
+            </w:r>
+          </w:p>
+        </w:tc>
+        <w:tc>
+          <w:tcPr>
+            <w:tcW w:type="dxa" w:w="1512"/>
+          </w:tcPr>
+          <w:p>
+            <w:pPr>
+              <w:spacing w:after="40"/>
+            </w:pPr>
+            <w:r/>
+            <w:r>
+              <w:rPr>
+                <w:rFonts w:ascii="Times New Roman" w:hAnsi="Times New Roman" w:eastAsia="宋体"/>
+                <w:b w:val="0"/>
+                <w:i w:val="0"/>
+                <w:sz w:val="20"/>
+              </w:rPr>
+              <w:t>—</w:t>
+            </w:r>
+          </w:p>
+        </w:tc>
+        <w:tc>
+          <w:tcPr>
+            <w:tcW w:type="dxa" w:w="1512"/>
+          </w:tcPr>
+          <w:p>
+            <w:pPr>
+              <w:spacing w:after="40"/>
+            </w:pPr>
+            <w:r/>
+            <w:r>
+              <w:rPr>
+                <w:rFonts w:ascii="Times New Roman" w:hAnsi="Times New Roman" w:eastAsia="宋体"/>
+                <w:b w:val="0"/>
+                <w:i w:val="0"/>
+                <w:sz w:val="20"/>
+              </w:rPr>
+              <w:t>FR-02 / FR-06</w:t>
+            </w:r>
+          </w:p>
+        </w:tc>
+        <w:tc>
+          <w:tcPr>
+            <w:tcW w:type="dxa" w:w="1512"/>
+          </w:tcPr>
+          <w:p>
+            <w:pPr>
+              <w:spacing w:after="40"/>
+            </w:pPr>
+            <w:r/>
+            <w:r>
+              <w:rPr>
+                <w:rFonts w:ascii="Times New Roman" w:hAnsi="Times New Roman" w:eastAsia="宋体"/>
+                <w:b w:val="0"/>
+                <w:i w:val="0"/>
+                <w:sz w:val="20"/>
+              </w:rPr>
+              <w:t>M3</w:t>
+            </w:r>
+          </w:p>
+        </w:tc>
+        <w:tc>
+          <w:tcPr>
+            <w:tcW w:type="dxa" w:w="1512"/>
+          </w:tcPr>
+          <w:p>
+            <w:pPr>
+              <w:spacing w:after="40"/>
+            </w:pPr>
+            <w:r/>
+            <w:r>
+              <w:rPr>
+                <w:rFonts w:ascii="Times New Roman" w:hAnsi="Times New Roman" w:eastAsia="宋体"/>
+                <w:b w:val="0"/>
+                <w:i w:val="0"/>
+                <w:sz w:val="20"/>
+              </w:rPr>
+              <w:t>学习设置 + 规则透明</w:t>
+            </w:r>
+          </w:p>
+        </w:tc>
+      </w:tr>
+      <w:tr>
+        <w:tc>
+          <w:tcPr>
+            <w:tcW w:type="dxa" w:w="1512"/>
+          </w:tcPr>
+          <w:p>
+            <w:pPr>
+              <w:spacing w:after="40"/>
+            </w:pPr>
+            <w:r/>
+            <w:r>
+              <w:rPr>
+                <w:rFonts w:ascii="Times New Roman" w:hAnsi="Times New Roman" w:eastAsia="宋体"/>
+                <w:b w:val="0"/>
+                <w:i w:val="0"/>
+                <w:sz w:val="20"/>
+              </w:rPr>
+              <w:t>13</w:t>
+            </w:r>
+          </w:p>
+        </w:tc>
+        <w:tc>
+          <w:tcPr>
+            <w:tcW w:type="dxa" w:w="1512"/>
+          </w:tcPr>
+          <w:p>
+            <w:pPr>
+              <w:spacing w:after="40"/>
+            </w:pPr>
+            <w:r/>
+            <w:r>
+              <w:rPr>
+                <w:rFonts w:ascii="Times New Roman" w:hAnsi="Times New Roman" w:eastAsia="宋体"/>
+                <w:b w:val="0"/>
+                <w:i w:val="0"/>
+                <w:sz w:val="20"/>
+              </w:rPr>
+              <w:t>13_books</w:t>
+            </w:r>
+          </w:p>
+        </w:tc>
+        <w:tc>
+          <w:tcPr>
+            <w:tcW w:type="dxa" w:w="1512"/>
+          </w:tcPr>
+          <w:p>
+            <w:pPr>
+              <w:spacing w:after="40"/>
+            </w:pPr>
+            <w:r/>
+            <w:r>
+              <w:rPr>
+                <w:rFonts w:ascii="Times New Roman" w:hAnsi="Times New Roman" w:eastAsia="宋体"/>
+                <w:b w:val="0"/>
+                <w:i w:val="0"/>
+                <w:sz w:val="20"/>
+              </w:rPr>
+              <w:t>§4.6 词书切换</w:t>
+            </w:r>
+          </w:p>
+        </w:tc>
+        <w:tc>
+          <w:tcPr>
+            <w:tcW w:type="dxa" w:w="1512"/>
+          </w:tcPr>
+          <w:p>
+            <w:pPr>
+              <w:spacing w:after="40"/>
+            </w:pPr>
+            <w:r/>
+            <w:r>
+              <w:rPr>
+                <w:rFonts w:ascii="Times New Roman" w:hAnsi="Times New Roman" w:eastAsia="宋体"/>
+                <w:b w:val="0"/>
+                <w:i w:val="0"/>
+                <w:sz w:val="20"/>
+              </w:rPr>
+              <w:t>FR-11 / FR-10</w:t>
+            </w:r>
+          </w:p>
+        </w:tc>
+        <w:tc>
+          <w:tcPr>
+            <w:tcW w:type="dxa" w:w="1512"/>
+          </w:tcPr>
+          <w:p>
+            <w:pPr>
+              <w:spacing w:after="40"/>
+            </w:pPr>
+            <w:r/>
+            <w:r>
+              <w:rPr>
+                <w:rFonts w:ascii="Times New Roman" w:hAnsi="Times New Roman" w:eastAsia="宋体"/>
+                <w:b w:val="0"/>
+                <w:i w:val="0"/>
+                <w:sz w:val="20"/>
+              </w:rPr>
+              <w:t>M3</w:t>
+            </w:r>
+          </w:p>
+        </w:tc>
+        <w:tc>
+          <w:tcPr>
+            <w:tcW w:type="dxa" w:w="1512"/>
+          </w:tcPr>
+          <w:p>
+            <w:pPr>
+              <w:spacing w:after="40"/>
+            </w:pPr>
+            <w:r/>
+            <w:r>
+              <w:rPr>
+                <w:rFonts w:ascii="Times New Roman" w:hAnsi="Times New Roman" w:eastAsia="宋体"/>
+                <w:b w:val="0"/>
+                <w:i w:val="0"/>
+                <w:sz w:val="20"/>
+              </w:rPr>
+              <w:t>词书列表与切换（主嵌图）</w:t>
+            </w:r>
+          </w:p>
+        </w:tc>
+      </w:tr>
+      <w:tr>
+        <w:tc>
+          <w:tcPr>
+            <w:tcW w:type="dxa" w:w="1512"/>
+          </w:tcPr>
+          <w:p>
+            <w:pPr>
+              <w:spacing w:after="40"/>
+            </w:pPr>
+            <w:r/>
+            <w:r>
+              <w:rPr>
+                <w:rFonts w:ascii="Times New Roman" w:hAnsi="Times New Roman" w:eastAsia="宋体"/>
+                <w:b w:val="0"/>
+                <w:i w:val="0"/>
+                <w:sz w:val="20"/>
+              </w:rPr>
+              <w:t>14</w:t>
+            </w:r>
+          </w:p>
+        </w:tc>
+        <w:tc>
+          <w:tcPr>
+            <w:tcW w:type="dxa" w:w="1512"/>
+          </w:tcPr>
+          <w:p>
+            <w:pPr>
+              <w:spacing w:after="40"/>
+            </w:pPr>
+            <w:r/>
+            <w:r>
+              <w:rPr>
+                <w:rFonts w:ascii="Times New Roman" w:hAnsi="Times New Roman" w:eastAsia="宋体"/>
+                <w:b w:val="0"/>
+                <w:i w:val="0"/>
+                <w:sz w:val="20"/>
+              </w:rPr>
+              <w:t>14_feedback</w:t>
+            </w:r>
+          </w:p>
+        </w:tc>
+        <w:tc>
+          <w:tcPr>
+            <w:tcW w:type="dxa" w:w="1512"/>
+          </w:tcPr>
+          <w:p>
+            <w:pPr>
+              <w:spacing w:after="40"/>
+            </w:pPr>
+            <w:r/>
+            <w:r>
+              <w:rPr>
+                <w:rFonts w:ascii="Times New Roman" w:hAnsi="Times New Roman" w:eastAsia="宋体"/>
+                <w:b w:val="0"/>
+                <w:i w:val="0"/>
+                <w:sz w:val="20"/>
+              </w:rPr>
+              <w:t>—</w:t>
+            </w:r>
+          </w:p>
+        </w:tc>
+        <w:tc>
+          <w:tcPr>
+            <w:tcW w:type="dxa" w:w="1512"/>
+          </w:tcPr>
+          <w:p>
+            <w:pPr>
+              <w:spacing w:after="40"/>
+            </w:pPr>
+            <w:r/>
+            <w:r>
+              <w:rPr>
+                <w:rFonts w:ascii="Times New Roman" w:hAnsi="Times New Roman" w:eastAsia="宋体"/>
+                <w:b w:val="0"/>
+                <w:i w:val="0"/>
+                <w:sz w:val="20"/>
+              </w:rPr>
+              <w:t>FR-10</w:t>
+            </w:r>
+          </w:p>
+        </w:tc>
+        <w:tc>
+          <w:tcPr>
+            <w:tcW w:type="dxa" w:w="1512"/>
+          </w:tcPr>
+          <w:p>
+            <w:pPr>
+              <w:spacing w:after="40"/>
+            </w:pPr>
+            <w:r/>
+            <w:r>
+              <w:rPr>
+                <w:rFonts w:ascii="Times New Roman" w:hAnsi="Times New Roman" w:eastAsia="宋体"/>
+                <w:b w:val="0"/>
+                <w:i w:val="0"/>
+                <w:sz w:val="20"/>
+              </w:rPr>
+              <w:t>M4</w:t>
+            </w:r>
+          </w:p>
+        </w:tc>
+        <w:tc>
+          <w:tcPr>
+            <w:tcW w:type="dxa" w:w="1512"/>
+          </w:tcPr>
+          <w:p>
+            <w:pPr>
+              <w:spacing w:after="40"/>
+            </w:pPr>
+            <w:r/>
+            <w:r>
+              <w:rPr>
+                <w:rFonts w:ascii="Times New Roman" w:hAnsi="Times New Roman" w:eastAsia="宋体"/>
+                <w:b w:val="0"/>
+                <w:i w:val="0"/>
+                <w:sz w:val="20"/>
+              </w:rPr>
+              <w:t>纠错反馈弹层</w:t>
+            </w:r>
+          </w:p>
+        </w:tc>
+      </w:tr>
+    </w:tbl>
+    <w:p/>
+    <w:p>
+      <w:pPr>
+        <w:spacing w:after="160"/>
+        <w:ind w:left="312"/>
+      </w:pPr>
+      <w:r>
+        <w:rPr>
+          <w:rFonts w:ascii="Times New Roman" w:hAnsi="Times New Roman" w:eastAsia="宋体"/>
+          <w:b w:val="0"/>
+          <w:i/>
+          <w:color w:val="556370"/>
+          <w:sz w:val="20"/>
+        </w:rPr>
+        <w:t>主流程嵌图页（02 / 06 / 07 / 08 / 10 / 13）的线框图已嵌入 §4.1–4.6，</w:t>
+      </w:r>
+    </w:p>
+    <w:p>
+      <w:pPr>
+        <w:spacing w:after="160"/>
+        <w:ind w:left="312"/>
+      </w:pPr>
+      <w:r>
+        <w:rPr>
+          <w:rFonts w:ascii="Times New Roman" w:hAnsi="Times New Roman" w:eastAsia="宋体"/>
+          <w:b w:val="0"/>
+          <w:i/>
+          <w:color w:val="556370"/>
+          <w:sz w:val="20"/>
+        </w:rPr>
+        <w:t>截图源文件位于 `docs/tools/images/prototype/`（由 `docs/tools/screenshot_prototype.py` 生成）。</w:t>
+      </w:r>
+    </w:p>
+    <w:p>
+      <w:pPr>
+        <w:spacing w:after="160"/>
+        <w:ind w:left="312"/>
+      </w:pPr>
+      <w:r>
+        <w:rPr>
+          <w:rFonts w:ascii="Times New Roman" w:hAnsi="Times New Roman" w:eastAsia="宋体"/>
+          <w:b w:val="0"/>
+          <w:i/>
+          <w:color w:val="556370"/>
+          <w:sz w:val="20"/>
+        </w:rPr>
+        <w:t>线框图为 1440 × 1200 视口截图，完整页面请以 HTML 走查版为准。</w:t>
+      </w:r>
+    </w:p>
+    <w:p>
+      <w:pPr>
+        <w:spacing w:after="120"/>
+      </w:pPr>
+      <w:r>
+        <w:rPr>
+          <w:rFonts w:ascii="Times New Roman" w:hAnsi="Times New Roman" w:eastAsia="宋体"/>
+          <w:b/>
+          <w:i w:val="0"/>
+          <w:sz w:val="21"/>
+        </w:rPr>
+        <w:t>校验</w:t>
+      </w:r>
+      <w:r>
+        <w:rPr>
+          <w:rFonts w:ascii="Times New Roman" w:hAnsi="Times New Roman" w:eastAsia="宋体"/>
+          <w:b w:val="0"/>
+          <w:i w:val="0"/>
+          <w:sz w:val="21"/>
+        </w:rPr>
+        <w:t>：`docs/tools/verify_prototype.py` 检查页面齐全、无死链、每页含标注条且与映射表一致、主嵌图页声明完整；`docs/tools/verify_prd.py` 校验 PRD 结构与关键章节。</w:t>
       </w:r>
     </w:p>
     <w:sectPr>

</xml_diff>